<commit_message>
Record successful Maven workflow run
</commit_message>
<xml_diff>
--- a/docs/guia-github-actions-e-seguranca.docx
+++ b/docs/guia-github-actions-e-seguranca.docx
@@ -702,6 +702,33 @@
         </w:r>
       </w:hyperlink>
     </w:p>
+    <w:p>
+      <w:pPr>
+        <w:pStyle w:val="Heading1"/>
+      </w:pPr>
+      <w:r>
+        <w:t>Resultado registrado no GitHub</w:t>
+      </w:r>
+    </w:p>
+    <w:p>
+      <w:r>
+        <w:t>Após o commit c852b11, o GitHub executou o workflow Build and test via pull_request. O job “Build and test with Maven” terminou com Success em 25 segundos. O workflow desse commit não executou Sonar. Este resultado foi adicionado ao guia depois da execução automática.</w:t>
+      </w:r>
+    </w:p>
+    <w:p>
+      <w:r>
+        <w:t xml:space="preserve">Abrir a execução: </w:t>
+      </w:r>
+      <w:hyperlink r:id="rId18">
+        <w:r>
+          <w:rPr>
+            <w:color w:val="0563C1"/>
+            <w:u w:val="single"/>
+          </w:rPr>
+          <w:t>GitHub Actions — execução do PR #7</w:t>
+        </w:r>
+      </w:hyperlink>
+    </w:p>
     <w:sectPr>
       <w:headerReference w:type="default" r:id="rId9"/>
       <w:footerReference w:type="default" r:id="rId10"/>

</xml_diff>

<commit_message>
Expand GHAS learning guide with screenshots
</commit_message>
<xml_diff>
--- a/docs/guia-github-actions-e-seguranca.docx
+++ b/docs/guia-github-actions-e-seguranca.docx
@@ -7,15 +7,7 @@
         <w:pStyle w:val="Title"/>
       </w:pPr>
       <w:r>
-        <w:t>GitHub Actions e segurança do repositório</w:t>
-      </w:r>
-    </w:p>
-    <w:p>
-      <w:r>
-        <w:rPr>
-          <w:i/>
-        </w:rPr>
-        <w:t>Guia incremental para o projeto Som &amp; Corda — loja de instrumentos</w:t>
+        <w:t>Guia prático: GitHub Actions e segurança do repositório</w:t>
       </w:r>
     </w:p>
     <w:p>
@@ -23,10 +15,53 @@
         <w:rPr>
           <w:b/>
         </w:rPr>
-        <w:t xml:space="preserve">Objetivo desta etapa: </w:t>
+        <w:t>Projeto:</w:t>
       </w:r>
       <w:r>
-        <w:t>observar o workflow nativo do GitHub sem a análise Sonar e registrar como CodeQL, Secret Protection e Dependabot estão configurados antes de ativá-los um por vez.</w:t>
+        <w:t xml:space="preserve"> Som &amp; Corda — loja de instrumentos</w:t>
+      </w:r>
+    </w:p>
+    <w:p>
+      <w:r>
+        <w:rPr>
+          <w:b/>
+        </w:rPr>
+        <w:t>Repositório:</w:t>
+      </w:r>
+      <w:r>
+        <w:t xml:space="preserve"> </w:t>
+      </w:r>
+      <w:r>
+        <w:rPr>
+          <w:rFonts w:ascii="Consolas" w:hAnsi="Consolas"/>
+          <w:color w:val="5B2C83"/>
+          <w:sz w:val="18"/>
+        </w:rPr>
+        <w:t>aeroschmidt/scanner-loja-instrumentos</w:t>
+      </w:r>
+    </w:p>
+    <w:p>
+      <w:r>
+        <w:rPr>
+          <w:b/>
+        </w:rPr>
+        <w:t>Registro de estado:</w:t>
+      </w:r>
+      <w:r>
+        <w:t xml:space="preserve"> 10 de outubro de 2026</w:t>
+      </w:r>
+    </w:p>
+    <w:p>
+      <w:r>
+        <w:t>Este guia registra o que está ativo, o que ainda está desligado e como cada participante acompanha os testes. A sequência será uma ferramenta por vez. Nenhuma ferramenta de GHAS é habilitada por este documento.</w:t>
+      </w:r>
+    </w:p>
+    <w:p>
+      <w:pPr>
+        <w:pStyle w:val="Heading1"/>
+      </w:pPr>
+      <w:r>
+        <w:t>1. Estado atual do projeto</w:t>
       </w:r>
     </w:p>
     <w:tbl>
@@ -37,54 +72,724 @@
         <w:tblLook w:firstColumn="1" w:firstRow="1" w:lastColumn="0" w:lastRow="0" w:noHBand="0" w:noVBand="1" w:val="04A0"/>
       </w:tblPr>
       <w:tblGrid>
-        <w:gridCol w:w="4968"/>
-        <w:gridCol w:w="4968"/>
+        <w:gridCol w:w="3331"/>
+        <w:gridCol w:w="3331"/>
+        <w:gridCol w:w="3331"/>
       </w:tblGrid>
       <w:tr>
         <w:tc>
           <w:tcPr>
-            <w:tcW w:type="dxa" w:w="4968"/>
+            <w:tcW w:type="dxa" w:w="3331"/>
             <w:vAlign w:val="center"/>
-            <w:shd w:fill="EAF1F8"/>
           </w:tcPr>
           <w:p>
-            <w:r/>
             <w:r>
               <w:rPr>
-                <w:b w:val="0"/>
+                <w:b/>
+                <w:color w:val="FFFFFF"/>
               </w:rPr>
-              <w:t>WORKFLOW DO PR #7</w:t>
-              <w:br/>
-              <w:t>Maven compila e executa testes via ./mvnw verify. Sonar removido do YAML nesta alteração.</w:t>
+              <w:t>Recurso</w:t>
             </w:r>
           </w:p>
         </w:tc>
         <w:tc>
           <w:tcPr>
-            <w:tcW w:type="dxa" w:w="4968"/>
+            <w:tcW w:type="dxa" w:w="3331"/>
             <w:vAlign w:val="center"/>
-            <w:shd w:fill="EAF1F8"/>
           </w:tcPr>
           <w:p>
-            <w:r/>
             <w:r>
               <w:rPr>
-                <w:b w:val="0"/>
+                <w:b/>
+                <w:color w:val="FFFFFF"/>
               </w:rPr>
-              <w:t>RECURSOS DE SEGURANÇA</w:t>
-              <w:br/>
-              <w:t>CodeQL, Dependabot e Secret Protection continuam desligados, conforme o escopo confirmado pela proprietária.</w:t>
+              <w:t>Estado observado</w:t>
+            </w:r>
+          </w:p>
+        </w:tc>
+        <w:tc>
+          <w:tcPr>
+            <w:tcW w:type="dxa" w:w="3331"/>
+            <w:vAlign w:val="center"/>
+          </w:tcPr>
+          <w:p>
+            <w:r>
+              <w:rPr>
+                <w:b/>
+                <w:color w:val="FFFFFF"/>
+              </w:rPr>
+              <w:t>O que significa agora</w:t>
+            </w:r>
+          </w:p>
+        </w:tc>
+      </w:tr>
+      <w:tr>
+        <w:tc>
+          <w:tcPr>
+            <w:tcW w:type="dxa" w:w="3331"/>
+            <w:vAlign w:val="center"/>
+          </w:tcPr>
+          <w:p>
+            <w:r>
+              <w:t>GitHub Actions</w:t>
+            </w:r>
+          </w:p>
+        </w:tc>
+        <w:tc>
+          <w:tcPr>
+            <w:tcW w:type="dxa" w:w="3331"/>
+            <w:vAlign w:val="center"/>
+          </w:tcPr>
+          <w:p>
+            <w:r>
+              <w:t>Ativo</w:t>
+            </w:r>
+          </w:p>
+        </w:tc>
+        <w:tc>
+          <w:tcPr>
+            <w:tcW w:type="dxa" w:w="3331"/>
+            <w:vAlign w:val="center"/>
+          </w:tcPr>
+          <w:p>
+            <w:r>
+              <w:t xml:space="preserve">O workflow </w:t>
+            </w:r>
+            <w:r>
+              <w:rPr>
+                <w:rFonts w:ascii="Consolas" w:hAnsi="Consolas"/>
+                <w:color w:val="5B2C83"/>
+                <w:sz w:val="18"/>
+              </w:rPr>
+              <w:t>Build and test</w:t>
+            </w:r>
+            <w:r>
+              <w:t xml:space="preserve"> executa Maven </w:t>
+            </w:r>
+            <w:r>
+              <w:rPr>
+                <w:rFonts w:ascii="Consolas" w:hAnsi="Consolas"/>
+                <w:color w:val="5B2C83"/>
+                <w:sz w:val="18"/>
+              </w:rPr>
+              <w:t>verify</w:t>
+            </w:r>
+            <w:r>
+              <w:t xml:space="preserve"> em </w:t>
+            </w:r>
+            <w:r>
+              <w:rPr>
+                <w:rFonts w:ascii="Consolas" w:hAnsi="Consolas"/>
+                <w:color w:val="5B2C83"/>
+                <w:sz w:val="18"/>
+              </w:rPr>
+              <w:t>push</w:t>
+            </w:r>
+            <w:r>
+              <w:t xml:space="preserve"> para </w:t>
+            </w:r>
+            <w:r>
+              <w:rPr>
+                <w:rFonts w:ascii="Consolas" w:hAnsi="Consolas"/>
+                <w:color w:val="5B2C83"/>
+                <w:sz w:val="18"/>
+              </w:rPr>
+              <w:t>main</w:t>
+            </w:r>
+            <w:r>
+              <w:t xml:space="preserve"> e em PR destinado a </w:t>
+            </w:r>
+            <w:r>
+              <w:rPr>
+                <w:rFonts w:ascii="Consolas" w:hAnsi="Consolas"/>
+                <w:color w:val="5B2C83"/>
+                <w:sz w:val="18"/>
+              </w:rPr>
+              <w:t>main</w:t>
+            </w:r>
+            <w:r>
+              <w:t>.</w:t>
+            </w:r>
+          </w:p>
+        </w:tc>
+      </w:tr>
+      <w:tr>
+        <w:tc>
+          <w:tcPr>
+            <w:tcW w:type="dxa" w:w="3331"/>
+            <w:vAlign w:val="center"/>
+          </w:tcPr>
+          <w:p>
+            <w:r>
+              <w:t>Sonar no workflow</w:t>
+            </w:r>
+          </w:p>
+        </w:tc>
+        <w:tc>
+          <w:tcPr>
+            <w:tcW w:type="dxa" w:w="3331"/>
+            <w:vAlign w:val="center"/>
+          </w:tcPr>
+          <w:p>
+            <w:r>
+              <w:t>Removido nesta etapa</w:t>
+            </w:r>
+          </w:p>
+        </w:tc>
+        <w:tc>
+          <w:tcPr>
+            <w:tcW w:type="dxa" w:w="3331"/>
+            <w:vAlign w:val="center"/>
+          </w:tcPr>
+          <w:p>
+            <w:r>
+              <w:t xml:space="preserve">O workflow não chama Sonar nem lê </w:t>
+            </w:r>
+            <w:r>
+              <w:rPr>
+                <w:rFonts w:ascii="Consolas" w:hAnsi="Consolas"/>
+                <w:color w:val="5B2C83"/>
+                <w:sz w:val="18"/>
+              </w:rPr>
+              <w:t>SONAR_TOKEN</w:t>
+            </w:r>
+            <w:r>
+              <w:t>. A análise local continua descrita no README.</w:t>
+            </w:r>
+          </w:p>
+        </w:tc>
+      </w:tr>
+      <w:tr>
+        <w:tc>
+          <w:tcPr>
+            <w:tcW w:type="dxa" w:w="3331"/>
+            <w:vAlign w:val="center"/>
+          </w:tcPr>
+          <w:p>
+            <w:r>
+              <w:t>Dependency graph</w:t>
+            </w:r>
+          </w:p>
+        </w:tc>
+        <w:tc>
+          <w:tcPr>
+            <w:tcW w:type="dxa" w:w="3331"/>
+            <w:vAlign w:val="center"/>
+          </w:tcPr>
+          <w:p>
+            <w:r>
+              <w:t>Off</w:t>
+            </w:r>
+          </w:p>
+        </w:tc>
+        <w:tc>
+          <w:tcPr>
+            <w:tcW w:type="dxa" w:w="3331"/>
+            <w:vAlign w:val="center"/>
+          </w:tcPr>
+          <w:p>
+            <w:r>
+              <w:t>Ainda não há inventário de dependências apresentado nesta tela do repositório.</w:t>
+            </w:r>
+          </w:p>
+        </w:tc>
+      </w:tr>
+      <w:tr>
+        <w:tc>
+          <w:tcPr>
+            <w:tcW w:type="dxa" w:w="3331"/>
+            <w:vAlign w:val="center"/>
+          </w:tcPr>
+          <w:p>
+            <w:r>
+              <w:t>Dependabot alerts / security updates</w:t>
+            </w:r>
+          </w:p>
+        </w:tc>
+        <w:tc>
+          <w:tcPr>
+            <w:tcW w:type="dxa" w:w="3331"/>
+            <w:vAlign w:val="center"/>
+          </w:tcPr>
+          <w:p>
+            <w:r>
+              <w:t>Off</w:t>
+            </w:r>
+          </w:p>
+        </w:tc>
+        <w:tc>
+          <w:tcPr>
+            <w:tcW w:type="dxa" w:w="3331"/>
+            <w:vAlign w:val="center"/>
+          </w:tcPr>
+          <w:p>
+            <w:r>
+              <w:t>Ainda não serão gerados alertas/PRs do Dependabot neste repositório.</w:t>
+            </w:r>
+          </w:p>
+        </w:tc>
+      </w:tr>
+      <w:tr>
+        <w:tc>
+          <w:tcPr>
+            <w:tcW w:type="dxa" w:w="3331"/>
+            <w:vAlign w:val="center"/>
+          </w:tcPr>
+          <w:p>
+            <w:r>
+              <w:t>Dependabot version updates</w:t>
+            </w:r>
+          </w:p>
+        </w:tc>
+        <w:tc>
+          <w:tcPr>
+            <w:tcW w:type="dxa" w:w="3331"/>
+            <w:vAlign w:val="center"/>
+          </w:tcPr>
+          <w:p>
+            <w:r>
+              <w:t>Não configurado</w:t>
+            </w:r>
+          </w:p>
+        </w:tc>
+        <w:tc>
+          <w:tcPr>
+            <w:tcW w:type="dxa" w:w="3331"/>
+            <w:vAlign w:val="center"/>
+          </w:tcPr>
+          <w:p>
+            <w:r>
+              <w:t xml:space="preserve">Não há </w:t>
+            </w:r>
+            <w:r>
+              <w:rPr>
+                <w:rFonts w:ascii="Consolas" w:hAnsi="Consolas"/>
+                <w:color w:val="5B2C83"/>
+                <w:sz w:val="18"/>
+              </w:rPr>
+              <w:t>.github/dependabot.yml</w:t>
+            </w:r>
+            <w:r>
+              <w:t>.</w:t>
+            </w:r>
+          </w:p>
+        </w:tc>
+      </w:tr>
+      <w:tr>
+        <w:tc>
+          <w:tcPr>
+            <w:tcW w:type="dxa" w:w="3331"/>
+            <w:vAlign w:val="center"/>
+          </w:tcPr>
+          <w:p>
+            <w:r>
+              <w:t>CodeQL / Code Scanning</w:t>
+            </w:r>
+          </w:p>
+        </w:tc>
+        <w:tc>
+          <w:tcPr>
+            <w:tcW w:type="dxa" w:w="3331"/>
+            <w:vAlign w:val="center"/>
+          </w:tcPr>
+          <w:p>
+            <w:r>
+              <w:t>Off</w:t>
+            </w:r>
+          </w:p>
+        </w:tc>
+        <w:tc>
+          <w:tcPr>
+            <w:tcW w:type="dxa" w:w="3331"/>
+            <w:vAlign w:val="center"/>
+          </w:tcPr>
+          <w:p>
+            <w:r>
+              <w:t xml:space="preserve">Settings oferece </w:t>
+            </w:r>
+            <w:r>
+              <w:rPr>
+                <w:rFonts w:ascii="Consolas" w:hAnsi="Consolas"/>
+                <w:color w:val="5B2C83"/>
+                <w:sz w:val="18"/>
+              </w:rPr>
+              <w:t>Set up</w:t>
+            </w:r>
+            <w:r>
+              <w:t>; não está escaneando o código.</w:t>
+            </w:r>
+          </w:p>
+        </w:tc>
+      </w:tr>
+      <w:tr>
+        <w:tc>
+          <w:tcPr>
+            <w:tcW w:type="dxa" w:w="3331"/>
+            <w:vAlign w:val="center"/>
+          </w:tcPr>
+          <w:p>
+            <w:r>
+              <w:t>Secret Protection</w:t>
+            </w:r>
+          </w:p>
+        </w:tc>
+        <w:tc>
+          <w:tcPr>
+            <w:tcW w:type="dxa" w:w="3331"/>
+            <w:vAlign w:val="center"/>
+          </w:tcPr>
+          <w:p>
+            <w:r>
+              <w:t>Off</w:t>
+            </w:r>
+          </w:p>
+        </w:tc>
+        <w:tc>
+          <w:tcPr>
+            <w:tcW w:type="dxa" w:w="3331"/>
+            <w:vAlign w:val="center"/>
+          </w:tcPr>
+          <w:p>
+            <w:r>
+              <w:t xml:space="preserve">Settings oferece </w:t>
+            </w:r>
+            <w:r>
+              <w:rPr>
+                <w:rFonts w:ascii="Consolas" w:hAnsi="Consolas"/>
+                <w:color w:val="5B2C83"/>
+                <w:sz w:val="18"/>
+              </w:rPr>
+              <w:t>Enable</w:t>
+            </w:r>
+            <w:r>
+              <w:t>. Em repositório público, padrões de parceiros podem continuar sendo reportados aos provedores, conforme a regra do GitHub.</w:t>
+            </w:r>
+          </w:p>
+        </w:tc>
+      </w:tr>
+      <w:tr>
+        <w:tc>
+          <w:tcPr>
+            <w:tcW w:type="dxa" w:w="3331"/>
+            <w:vAlign w:val="center"/>
+          </w:tcPr>
+          <w:p>
+            <w:r>
+              <w:t>Copilot Autofix</w:t>
+            </w:r>
+          </w:p>
+        </w:tc>
+        <w:tc>
+          <w:tcPr>
+            <w:tcW w:type="dxa" w:w="3331"/>
+            <w:vAlign w:val="center"/>
+          </w:tcPr>
+          <w:p>
+            <w:r>
+              <w:t>On na tela</w:t>
+            </w:r>
+          </w:p>
+        </w:tc>
+        <w:tc>
+          <w:tcPr>
+            <w:tcW w:type="dxa" w:w="3331"/>
+            <w:vAlign w:val="center"/>
+          </w:tcPr>
+          <w:p>
+            <w:r>
+              <w:t>Depende de CodeQL habilitado para propor correções de alertas CodeQL; não foi alterado.</w:t>
             </w:r>
           </w:p>
         </w:tc>
       </w:tr>
     </w:tbl>
+    <w:p/>
+    <w:p>
+      <w:r>
+        <w:rPr>
+          <w:b/>
+        </w:rPr>
+        <w:t>Captura 1 — Settings &gt; Advanced Security:</w:t>
+      </w:r>
+      <w:r>
+        <w:t xml:space="preserve"> Dependency graph desligado.</w:t>
+      </w:r>
+    </w:p>
+    <w:p>
+      <w:pPr>
+        <w:jc w:val="center"/>
+      </w:pPr>
+      <w:r>
+        <w:drawing>
+          <wp:inline xmlns:a="http://schemas.openxmlformats.org/drawingml/2006/main" xmlns:pic="http://schemas.openxmlformats.org/drawingml/2006/picture">
+            <wp:extent cx="5806440" cy="4429069"/>
+            <wp:docPr id="1" name="Picture 1"/>
+            <wp:cNvGraphicFramePr>
+              <a:graphicFrameLocks noChangeAspect="1"/>
+            </wp:cNvGraphicFramePr>
+            <a:graphic>
+              <a:graphicData uri="http://schemas.openxmlformats.org/drawingml/2006/picture">
+                <pic:pic>
+                  <pic:nvPicPr>
+                    <pic:cNvPr id="0" name="01-dependency-graph-off.jpg"/>
+                    <pic:cNvPicPr/>
+                  </pic:nvPicPr>
+                  <pic:blipFill>
+                    <a:blip r:embed="rId11"/>
+                    <a:stretch>
+                      <a:fillRect/>
+                    </a:stretch>
+                  </pic:blipFill>
+                  <pic:spPr>
+                    <a:xfrm>
+                      <a:off x="0" y="0"/>
+                      <a:ext cx="5806440" cy="4429069"/>
+                    </a:xfrm>
+                    <a:prstGeom prst="rect"/>
+                  </pic:spPr>
+                </pic:pic>
+              </a:graphicData>
+            </a:graphic>
+          </wp:inline>
+        </w:drawing>
+      </w:r>
+    </w:p>
+    <w:p>
+      <w:pPr>
+        <w:pStyle w:val="Caption"/>
+        <w:jc w:val="center"/>
+      </w:pPr>
+      <w:r>
+        <w:t>Settings: Dependency graph desligado</w:t>
+      </w:r>
+    </w:p>
+    <w:p>
+      <w:r>
+        <w:rPr>
+          <w:b/>
+        </w:rPr>
+        <w:t>Captura 2 — Dependabot e CodeQL:</w:t>
+      </w:r>
+      <w:r>
+        <w:t xml:space="preserve"> opções de atualização do Dependabot desligadas e CodeQL aguardando </w:t>
+      </w:r>
+      <w:r>
+        <w:rPr>
+          <w:rFonts w:ascii="Consolas" w:hAnsi="Consolas"/>
+          <w:color w:val="5B2C83"/>
+          <w:sz w:val="18"/>
+        </w:rPr>
+        <w:t>Set up</w:t>
+      </w:r>
+      <w:r>
+        <w:t>.</w:t>
+      </w:r>
+    </w:p>
+    <w:p>
+      <w:pPr>
+        <w:jc w:val="center"/>
+      </w:pPr>
+      <w:r>
+        <w:drawing>
+          <wp:inline xmlns:a="http://schemas.openxmlformats.org/drawingml/2006/main" xmlns:pic="http://schemas.openxmlformats.org/drawingml/2006/picture">
+            <wp:extent cx="5806440" cy="4429069"/>
+            <wp:docPr id="2" name="Picture 2"/>
+            <wp:cNvGraphicFramePr>
+              <a:graphicFrameLocks noChangeAspect="1"/>
+            </wp:cNvGraphicFramePr>
+            <a:graphic>
+              <a:graphicData uri="http://schemas.openxmlformats.org/drawingml/2006/picture">
+                <pic:pic>
+                  <pic:nvPicPr>
+                    <pic:cNvPr id="0" name="04-dependabot-codeql-config.jpg"/>
+                    <pic:cNvPicPr/>
+                  </pic:nvPicPr>
+                  <pic:blipFill>
+                    <a:blip r:embed="rId12"/>
+                    <a:stretch>
+                      <a:fillRect/>
+                    </a:stretch>
+                  </pic:blipFill>
+                  <pic:spPr>
+                    <a:xfrm>
+                      <a:off x="0" y="0"/>
+                      <a:ext cx="5806440" cy="4429069"/>
+                    </a:xfrm>
+                    <a:prstGeom prst="rect"/>
+                  </pic:spPr>
+                </pic:pic>
+              </a:graphicData>
+            </a:graphic>
+          </wp:inline>
+        </w:drawing>
+      </w:r>
+    </w:p>
+    <w:p>
+      <w:pPr>
+        <w:pStyle w:val="Caption"/>
+        <w:jc w:val="center"/>
+      </w:pPr>
+      <w:r>
+        <w:t>Settings: Dependabot desligado e CodeQL sem configuração</w:t>
+      </w:r>
+    </w:p>
+    <w:p>
+      <w:r>
+        <w:rPr>
+          <w:b/>
+        </w:rPr>
+        <w:t>Captura 3 — Secret Protection:</w:t>
+      </w:r>
+      <w:r>
+        <w:t xml:space="preserve"> botão </w:t>
+      </w:r>
+      <w:r>
+        <w:rPr>
+          <w:rFonts w:ascii="Consolas" w:hAnsi="Consolas"/>
+          <w:color w:val="5B2C83"/>
+          <w:sz w:val="18"/>
+        </w:rPr>
+        <w:t>Enable</w:t>
+      </w:r>
+      <w:r>
+        <w:t xml:space="preserve"> disponível, sem habilitação feita.</w:t>
+      </w:r>
+    </w:p>
+    <w:p>
+      <w:pPr>
+        <w:jc w:val="center"/>
+      </w:pPr>
+      <w:r>
+        <w:drawing>
+          <wp:inline xmlns:a="http://schemas.openxmlformats.org/drawingml/2006/main" xmlns:pic="http://schemas.openxmlformats.org/drawingml/2006/picture">
+            <wp:extent cx="5806440" cy="6462352"/>
+            <wp:docPr id="3" name="Picture 3"/>
+            <wp:cNvGraphicFramePr>
+              <a:graphicFrameLocks noChangeAspect="1"/>
+            </wp:cNvGraphicFramePr>
+            <a:graphic>
+              <a:graphicData uri="http://schemas.openxmlformats.org/drawingml/2006/picture">
+                <pic:pic>
+                  <pic:nvPicPr>
+                    <pic:cNvPr id="0" name="02-secret-protection.jpg"/>
+                    <pic:cNvPicPr/>
+                  </pic:nvPicPr>
+                  <pic:blipFill>
+                    <a:blip r:embed="rId13"/>
+                    <a:stretch>
+                      <a:fillRect/>
+                    </a:stretch>
+                  </pic:blipFill>
+                  <pic:spPr>
+                    <a:xfrm>
+                      <a:off x="0" y="0"/>
+                      <a:ext cx="5806440" cy="6462352"/>
+                    </a:xfrm>
+                    <a:prstGeom prst="rect"/>
+                  </pic:spPr>
+                </pic:pic>
+              </a:graphicData>
+            </a:graphic>
+          </wp:inline>
+        </w:drawing>
+      </w:r>
+    </w:p>
+    <w:p>
+      <w:pPr>
+        <w:pStyle w:val="Caption"/>
+        <w:jc w:val="center"/>
+      </w:pPr>
+      <w:r>
+        <w:t>Settings: Secret Protection desligado</w:t>
+      </w:r>
+    </w:p>
+    <w:p>
+      <w:r>
+        <w:rPr>
+          <w:b/>
+        </w:rPr>
+        <w:t>Captura 4 — Actions:</w:t>
+      </w:r>
+      <w:r>
+        <w:t xml:space="preserve"> execução de </w:t>
+      </w:r>
+      <w:r>
+        <w:rPr>
+          <w:rFonts w:ascii="Consolas" w:hAnsi="Consolas"/>
+          <w:color w:val="5B2C83"/>
+          <w:sz w:val="18"/>
+        </w:rPr>
+        <w:t>Build and test</w:t>
+      </w:r>
+      <w:r>
+        <w:t xml:space="preserve"> no PR #7 com resultado </w:t>
+      </w:r>
+      <w:r>
+        <w:rPr>
+          <w:rFonts w:ascii="Consolas" w:hAnsi="Consolas"/>
+          <w:color w:val="5B2C83"/>
+          <w:sz w:val="18"/>
+        </w:rPr>
+        <w:t>Success</w:t>
+      </w:r>
+      <w:r>
+        <w:t>.</w:t>
+      </w:r>
+    </w:p>
+    <w:p>
+      <w:pPr>
+        <w:jc w:val="center"/>
+      </w:pPr>
+      <w:r>
+        <w:drawing>
+          <wp:inline xmlns:a="http://schemas.openxmlformats.org/drawingml/2006/main" xmlns:pic="http://schemas.openxmlformats.org/drawingml/2006/picture">
+            <wp:extent cx="5806440" cy="4429484"/>
+            <wp:docPr id="4" name="Picture 4"/>
+            <wp:cNvGraphicFramePr>
+              <a:graphicFrameLocks noChangeAspect="1"/>
+            </wp:cNvGraphicFramePr>
+            <a:graphic>
+              <a:graphicData uri="http://schemas.openxmlformats.org/drawingml/2006/picture">
+                <pic:pic>
+                  <pic:nvPicPr>
+                    <pic:cNvPr id="0" name="03-actions-run-success.jpg"/>
+                    <pic:cNvPicPr/>
+                  </pic:nvPicPr>
+                  <pic:blipFill>
+                    <a:blip r:embed="rId14"/>
+                    <a:stretch>
+                      <a:fillRect/>
+                    </a:stretch>
+                  </pic:blipFill>
+                  <pic:spPr>
+                    <a:xfrm>
+                      <a:off x="0" y="0"/>
+                      <a:ext cx="5806440" cy="4429484"/>
+                    </a:xfrm>
+                    <a:prstGeom prst="rect"/>
+                  </pic:spPr>
+                </pic:pic>
+              </a:graphicData>
+            </a:graphic>
+          </wp:inline>
+        </w:drawing>
+      </w:r>
+    </w:p>
+    <w:p>
+      <w:pPr>
+        <w:pStyle w:val="Caption"/>
+        <w:jc w:val="center"/>
+      </w:pPr>
+      <w:r>
+        <w:t>Actions: workflow Maven concluído com sucesso</w:t>
+      </w:r>
+    </w:p>
     <w:p>
       <w:pPr>
         <w:pStyle w:val="Heading1"/>
       </w:pPr>
       <w:r>
-        <w:t>1. Para a proprietária / administração do repositório</w:t>
+        <w:t>2. Para quem administra o repositório</w:t>
       </w:r>
     </w:p>
     <w:p>
@@ -92,7 +797,136 @@
         <w:pStyle w:val="Heading2"/>
       </w:pPr>
       <w:r>
-        <w:t>O que mudou no PR #7</w:t>
+        <w:t>A. Entender o GitHub Actions que já existe</w:t>
+      </w:r>
+    </w:p>
+    <w:p>
+      <w:pPr>
+        <w:pStyle w:val="ListNumber"/>
+      </w:pPr>
+      <w:r>
+        <w:t xml:space="preserve">Abra o repositório e selecione </w:t>
+      </w:r>
+      <w:r>
+        <w:rPr>
+          <w:b/>
+        </w:rPr>
+        <w:t>Actions</w:t>
+      </w:r>
+      <w:r>
+        <w:t xml:space="preserve"> (a execução bem-sucedida está na Captura 4).</w:t>
+      </w:r>
+    </w:p>
+    <w:p>
+      <w:pPr>
+        <w:pStyle w:val="ListNumber"/>
+      </w:pPr>
+      <w:r>
+        <w:t xml:space="preserve">Abra uma execução do workflow </w:t>
+      </w:r>
+      <w:r>
+        <w:rPr>
+          <w:b/>
+        </w:rPr>
+        <w:t>Build and test</w:t>
+      </w:r>
+      <w:r>
+        <w:t>.</w:t>
+      </w:r>
+    </w:p>
+    <w:p>
+      <w:pPr>
+        <w:pStyle w:val="ListNumber"/>
+      </w:pPr>
+      <w:r>
+        <w:t>Confira o evento que iniciou a execução (</w:t>
+      </w:r>
+      <w:r>
+        <w:rPr>
+          <w:rFonts w:ascii="Consolas" w:hAnsi="Consolas"/>
+          <w:color w:val="5B2C83"/>
+          <w:sz w:val="18"/>
+        </w:rPr>
+        <w:t>push</w:t>
+      </w:r>
+      <w:r>
+        <w:t xml:space="preserve"> ou </w:t>
+      </w:r>
+      <w:r>
+        <w:rPr>
+          <w:rFonts w:ascii="Consolas" w:hAnsi="Consolas"/>
+          <w:color w:val="5B2C83"/>
+          <w:sz w:val="18"/>
+        </w:rPr>
+        <w:t>pull_request</w:t>
+      </w:r>
+      <w:r>
+        <w:t>), o job e seus steps.</w:t>
+      </w:r>
+    </w:p>
+    <w:p>
+      <w:pPr>
+        <w:pStyle w:val="ListNumber"/>
+      </w:pPr>
+      <w:r>
+        <w:t xml:space="preserve">Abra </w:t>
+      </w:r>
+      <w:r>
+        <w:rPr>
+          <w:b/>
+        </w:rPr>
+        <w:t>Build, test, and analyze with SonarQube</w:t>
+      </w:r>
+      <w:r>
+        <w:t xml:space="preserve"> apenas em execuções históricas; no workflow atual, o step executa </w:t>
+      </w:r>
+      <w:r>
+        <w:rPr>
+          <w:rFonts w:ascii="Consolas" w:hAnsi="Consolas"/>
+          <w:color w:val="5B2C83"/>
+          <w:sz w:val="18"/>
+        </w:rPr>
+        <w:t>./mvnw --batch-mode --no-transfer-progress verify</w:t>
+      </w:r>
+      <w:r>
+        <w:t>.</w:t>
+      </w:r>
+    </w:p>
+    <w:p>
+      <w:pPr>
+        <w:pStyle w:val="ListNumber"/>
+      </w:pPr>
+      <w:r>
+        <w:t xml:space="preserve">Em </w:t>
+      </w:r>
+      <w:r>
+        <w:rPr>
+          <w:rFonts w:ascii="Consolas" w:hAnsi="Consolas"/>
+          <w:color w:val="5B2C83"/>
+          <w:sz w:val="18"/>
+        </w:rPr>
+        <w:t>build.yml</w:t>
+      </w:r>
+      <w:r>
+        <w:t>, identifique os gatilhos, o runner, a preparação do Java, o cache Maven e o comando de build. A execução recente registrada concluiu com sucesso.</w:t>
+      </w:r>
+    </w:p>
+    <w:p>
+      <w:r>
+        <w:t>O Actions coordena o workflow; Maven compila o projeto e roda os testes. Um check de Actions não significa que CodeQL, Dependabot ou Secret Scanning estejam ativos.</w:t>
+      </w:r>
+    </w:p>
+    <w:p>
+      <w:pPr>
+        <w:pStyle w:val="Heading2"/>
+      </w:pPr>
+      <w:r>
+        <w:t>B. Dependabot — testar primeiro</w:t>
+      </w:r>
+    </w:p>
+    <w:p>
+      <w:r>
+        <w:t>Dependabot cobre dois comportamentos distintos:</w:t>
       </w:r>
     </w:p>
     <w:p>
@@ -100,7 +934,13 @@
         <w:pStyle w:val="ListBullet"/>
       </w:pPr>
       <w:r>
-        <w:t>Em .github/workflows/build.yml, o step deixou de executar sonar-maven-plugin e passou a executar bash ./mvnw --batch-mode --no-transfer-progress verify.</w:t>
+        <w:rPr>
+          <w:b/>
+        </w:rPr>
+        <w:t>Dependabot alerts:</w:t>
+      </w:r>
+      <w:r>
+        <w:t xml:space="preserve"> avisa que uma dependência usada tem vulnerabilidade conhecida.</w:t>
       </w:r>
     </w:p>
     <w:p>
@@ -108,7 +948,13 @@
         <w:pStyle w:val="ListBullet"/>
       </w:pPr>
       <w:r>
-        <w:t>A variável SONAR_TOKEN foi removida do job. O workflow não lê nem envia credenciais do Sonar nesta fase.</w:t>
+        <w:rPr>
+          <w:b/>
+        </w:rPr>
+        <w:t>Security updates:</w:t>
+      </w:r>
+      <w:r>
+        <w:t xml:space="preserve"> pode abrir PR para atualizar dependência vulnerável quando há correção compatível.</w:t>
       </w:r>
     </w:p>
     <w:p>
@@ -116,7 +962,575 @@
         <w:pStyle w:val="ListBullet"/>
       </w:pPr>
       <w:r>
-        <w:t>Gatilhos, runner, checkout, Java 21 e cache Maven foram mantidos: push para main e pull request destinado a main.</w:t>
+        <w:rPr>
+          <w:b/>
+        </w:rPr>
+        <w:t>Version updates:</w:t>
+      </w:r>
+      <w:r>
+        <w:t xml:space="preserve"> procura novas versões mesmo sem alerta de vulnerabilidade; depende de </w:t>
+      </w:r>
+      <w:r>
+        <w:rPr>
+          <w:rFonts w:ascii="Consolas" w:hAnsi="Consolas"/>
+          <w:color w:val="5B2C83"/>
+          <w:sz w:val="18"/>
+        </w:rPr>
+        <w:t>.github/dependabot.yml</w:t>
+      </w:r>
+      <w:r>
+        <w:t>.</w:t>
+      </w:r>
+    </w:p>
+    <w:p>
+      <w:r>
+        <w:t>Fluxo de administração, quando a proprietária decidir iniciar este teste:</w:t>
+      </w:r>
+    </w:p>
+    <w:p>
+      <w:pPr>
+        <w:pStyle w:val="ListNumber"/>
+      </w:pPr>
+      <w:r>
+        <w:t xml:space="preserve">Abra </w:t>
+      </w:r>
+      <w:r>
+        <w:rPr>
+          <w:b/>
+        </w:rPr>
+        <w:t>Settings &gt; Advanced Security</w:t>
+      </w:r>
+      <w:r>
+        <w:t>.</w:t>
+      </w:r>
+    </w:p>
+    <w:p>
+      <w:pPr>
+        <w:pStyle w:val="ListNumber"/>
+      </w:pPr>
+      <w:r>
+        <w:t xml:space="preserve">Ative </w:t>
+      </w:r>
+      <w:r>
+        <w:rPr>
+          <w:b/>
+        </w:rPr>
+        <w:t>Dependency graph</w:t>
+      </w:r>
+      <w:r>
+        <w:t xml:space="preserve"> e, separadamente, </w:t>
+      </w:r>
+      <w:r>
+        <w:rPr>
+          <w:b/>
+        </w:rPr>
+        <w:t>Dependabot alerts</w:t>
+      </w:r>
+      <w:r>
+        <w:t>. Registre quais alertas aparecem.</w:t>
+      </w:r>
+    </w:p>
+    <w:p>
+      <w:pPr>
+        <w:pStyle w:val="ListNumber"/>
+      </w:pPr>
+      <w:r>
+        <w:t xml:space="preserve">Em uma etapa posterior, ative </w:t>
+      </w:r>
+      <w:r>
+        <w:rPr>
+          <w:b/>
+        </w:rPr>
+        <w:t>Dependabot security updates</w:t>
+      </w:r>
+      <w:r>
+        <w:t xml:space="preserve"> e observe se ele cria um PR de correção. Alertas e atualizações são opções diferentes.</w:t>
+      </w:r>
+    </w:p>
+    <w:p>
+      <w:pPr>
+        <w:pStyle w:val="ListNumber"/>
+      </w:pPr>
+      <w:r>
+        <w:t xml:space="preserve">Teste </w:t>
+      </w:r>
+      <w:r>
+        <w:rPr>
+          <w:b/>
+        </w:rPr>
+        <w:t>version updates</w:t>
+      </w:r>
+      <w:r>
+        <w:t xml:space="preserve"> somente quando decidir adicionar </w:t>
+      </w:r>
+      <w:r>
+        <w:rPr>
+          <w:rFonts w:ascii="Consolas" w:hAnsi="Consolas"/>
+          <w:color w:val="5B2C83"/>
+          <w:sz w:val="18"/>
+        </w:rPr>
+        <w:t>.github/dependabot.yml</w:t>
+      </w:r>
+      <w:r>
+        <w:t xml:space="preserve">; selecione ecossistema Maven, diretório </w:t>
+      </w:r>
+      <w:r>
+        <w:rPr>
+          <w:rFonts w:ascii="Consolas" w:hAnsi="Consolas"/>
+          <w:color w:val="5B2C83"/>
+          <w:sz w:val="18"/>
+        </w:rPr>
+        <w:t>/</w:t>
+      </w:r>
+      <w:r>
+        <w:t xml:space="preserve"> e agenda apropriada.</w:t>
+      </w:r>
+    </w:p>
+    <w:p>
+      <w:pPr>
+        <w:pStyle w:val="ListNumber"/>
+      </w:pPr>
+      <w:r>
+        <w:t>Compare o PR automático com o PR comum: versão alterada, motivo, checks, logs e resultado de merge. O administrador não deve habilitar as etapas seguintes sem decidir que esta observação terminou.</w:t>
+      </w:r>
+    </w:p>
+    <w:p>
+      <w:pPr>
+        <w:pStyle w:val="Heading2"/>
+      </w:pPr>
+      <w:r>
+        <w:t>C. Code Scanning com CodeQL — etapa separada</w:t>
+      </w:r>
+    </w:p>
+    <w:p>
+      <w:pPr>
+        <w:pStyle w:val="ListNumber"/>
+      </w:pPr>
+      <w:r>
+        <w:t xml:space="preserve">Abra </w:t>
+      </w:r>
+      <w:r>
+        <w:rPr>
+          <w:b/>
+        </w:rPr>
+        <w:t>Settings &gt; Advanced Security &gt; Code Security &gt; CodeQL analysis &gt; Set up</w:t>
+      </w:r>
+      <w:r>
+        <w:t>.</w:t>
+      </w:r>
+    </w:p>
+    <w:p>
+      <w:pPr>
+        <w:pStyle w:val="ListNumber"/>
+      </w:pPr>
+      <w:r>
+        <w:t xml:space="preserve">Prefira </w:t>
+      </w:r>
+      <w:r>
+        <w:rPr>
+          <w:b/>
+        </w:rPr>
+        <w:t>Default setup</w:t>
+      </w:r>
+      <w:r>
+        <w:t xml:space="preserve"> para este teste inicial. Revise as linguagens que o GitHub detectou e a configuração proposta.</w:t>
+      </w:r>
+    </w:p>
+    <w:p>
+      <w:pPr>
+        <w:pStyle w:val="ListNumber"/>
+      </w:pPr>
+      <w:r>
+        <w:t xml:space="preserve">Confirme </w:t>
+      </w:r>
+      <w:r>
+        <w:rPr>
+          <w:b/>
+        </w:rPr>
+        <w:t>Enable CodeQL</w:t>
+      </w:r>
+      <w:r>
+        <w:t xml:space="preserve"> somente quando este teste for autorizado.</w:t>
+      </w:r>
+    </w:p>
+    <w:p>
+      <w:pPr>
+        <w:pStyle w:val="ListNumber"/>
+      </w:pPr>
+      <w:r>
+        <w:t xml:space="preserve">Aguarde a primeira análise e consulte </w:t>
+      </w:r>
+      <w:r>
+        <w:rPr>
+          <w:b/>
+        </w:rPr>
+        <w:t>Security &gt; Code scanning</w:t>
+      </w:r>
+      <w:r>
+        <w:t>.</w:t>
+      </w:r>
+    </w:p>
+    <w:p>
+      <w:pPr>
+        <w:pStyle w:val="ListNumber"/>
+      </w:pPr>
+      <w:r>
+        <w:t>Em um PR de teste autorizado, confira alertas, arquivo/linha, explicação, severidade e o check de Code Scanning.</w:t>
+      </w:r>
+    </w:p>
+    <w:p>
+      <w:pPr>
+        <w:pStyle w:val="ListNumber"/>
+      </w:pPr>
+      <w:r>
+        <w:t>Registre que falhar um check só bloqueia merge quando as regras de proteção da branch exigirem esse check.</w:t>
+      </w:r>
+    </w:p>
+    <w:p>
+      <w:r>
+        <w:t>Default setup é uma configuração do Code Scanning gerenciada pelo GitHub. Não é necessário acrescentar manualmente uma segunda workflow de CodeQL para esse caminho.</w:t>
+      </w:r>
+    </w:p>
+    <w:p>
+      <w:pPr>
+        <w:pStyle w:val="Heading2"/>
+      </w:pPr>
+      <w:r>
+        <w:t>D. Secret Scanning — etapa separada</w:t>
+      </w:r>
+    </w:p>
+    <w:p>
+      <w:pPr>
+        <w:pStyle w:val="ListNumber"/>
+      </w:pPr>
+      <w:r>
+        <w:t xml:space="preserve">Abra </w:t>
+      </w:r>
+      <w:r>
+        <w:rPr>
+          <w:b/>
+        </w:rPr>
+        <w:t>Settings &gt; Advanced Security &gt; Secret Protection &gt; Enable</w:t>
+      </w:r>
+      <w:r>
+        <w:t>.</w:t>
+      </w:r>
+    </w:p>
+    <w:p>
+      <w:pPr>
+        <w:pStyle w:val="ListNumber"/>
+      </w:pPr>
+      <w:r>
+        <w:t>Leia a confirmação apresentada pelo GitHub e confira quais recursos estão incluídos para este repositório e plano.</w:t>
+      </w:r>
+    </w:p>
+    <w:p>
+      <w:pPr>
+        <w:pStyle w:val="ListNumber"/>
+      </w:pPr>
+      <w:r>
+        <w:t xml:space="preserve">Depois de ativar Secret Protection, examine separadamente </w:t>
+      </w:r>
+      <w:r>
+        <w:rPr>
+          <w:b/>
+        </w:rPr>
+        <w:t>Push protection</w:t>
+      </w:r>
+      <w:r>
+        <w:t xml:space="preserve"> e só a ative quando essa for a etapa autorizada.</w:t>
+      </w:r>
+    </w:p>
+    <w:p>
+      <w:pPr>
+        <w:pStyle w:val="ListNumber"/>
+      </w:pPr>
+      <w:r>
+        <w:t>Registre a diferença: Secret Scanning procura padrões de credenciais já presentes; Push protection pode bloquear um push que contenha um padrão reconhecido.</w:t>
+      </w:r>
+    </w:p>
+    <w:p>
+      <w:pPr>
+        <w:pStyle w:val="ListNumber"/>
+      </w:pPr>
+      <w:r>
+        <w:t>Não use credenciais reais em testes. Se for necessário validar detecção, use o procedimento e os valores de teste indicados pela documentação oficial do GitHub.</w:t>
+      </w:r>
+    </w:p>
+    <w:p>
+      <w:r>
+        <w:t>Regras e disponibilidade de funcionalidades dependem de visibilidade e plano do repositório. Em repositórios públicos, o GitHub informa que envia alertas de padrões de parceiros aos provedores correspondentes; isso não deve ser confundido com a configuração dos alertas privados para a proprietária.</w:t>
+      </w:r>
+    </w:p>
+    <w:p>
+      <w:pPr>
+        <w:pStyle w:val="Heading2"/>
+      </w:pPr>
+      <w:r>
+        <w:t>E. Depois dos testes: Sonar por último</w:t>
+      </w:r>
+    </w:p>
+    <w:p>
+      <w:r>
+        <w:t xml:space="preserve">Quando Dependabot, CodeQL e Secret Scanning tiverem sido testados e registrados, a última etapa será reintroduzir Sonar no workflow. Então poderemos comparar checks nativos do GitHub com a análise e o Quality Gate do Sonar. Até lá, o workflow não usa </w:t>
+      </w:r>
+      <w:r>
+        <w:rPr>
+          <w:rFonts w:ascii="Consolas" w:hAnsi="Consolas"/>
+          <w:color w:val="5B2C83"/>
+          <w:sz w:val="18"/>
+        </w:rPr>
+        <w:t>SONAR_TOKEN</w:t>
+      </w:r>
+      <w:r>
+        <w:t>.</w:t>
+      </w:r>
+    </w:p>
+    <w:p>
+      <w:pPr>
+        <w:pStyle w:val="Heading1"/>
+      </w:pPr>
+      <w:r>
+        <w:t>3. Para quem cria ou revisa PRs</w:t>
+      </w:r>
+    </w:p>
+    <w:p>
+      <w:pPr>
+        <w:pStyle w:val="Heading2"/>
+      </w:pPr>
+      <w:r>
+        <w:t>PR comum com Actions</w:t>
+      </w:r>
+    </w:p>
+    <w:p>
+      <w:pPr>
+        <w:pStyle w:val="ListNumber"/>
+      </w:pPr>
+      <w:r>
+        <w:t>Crie uma branch e faça commits assinados conforme a configuração do repositório.</w:t>
+      </w:r>
+    </w:p>
+    <w:p>
+      <w:pPr>
+        <w:pStyle w:val="ListNumber"/>
+      </w:pPr>
+      <w:r>
+        <w:t xml:space="preserve">Abra um PR para </w:t>
+      </w:r>
+      <w:r>
+        <w:rPr>
+          <w:rFonts w:ascii="Consolas" w:hAnsi="Consolas"/>
+          <w:color w:val="5B2C83"/>
+          <w:sz w:val="18"/>
+        </w:rPr>
+        <w:t>main</w:t>
+      </w:r>
+      <w:r>
+        <w:t xml:space="preserve"> e explique a mudança.</w:t>
+      </w:r>
+    </w:p>
+    <w:p>
+      <w:pPr>
+        <w:pStyle w:val="ListNumber"/>
+      </w:pPr>
+      <w:r>
+        <w:t xml:space="preserve">Em </w:t>
+      </w:r>
+      <w:r>
+        <w:rPr>
+          <w:b/>
+        </w:rPr>
+        <w:t>Checks</w:t>
+      </w:r>
+      <w:r>
+        <w:t xml:space="preserve">, aguarde </w:t>
+      </w:r>
+      <w:r>
+        <w:rPr>
+          <w:b/>
+        </w:rPr>
+        <w:t>Build and test / Build and test with Maven</w:t>
+      </w:r>
+      <w:r>
+        <w:t>.</w:t>
+      </w:r>
+    </w:p>
+    <w:p>
+      <w:pPr>
+        <w:pStyle w:val="ListNumber"/>
+      </w:pPr>
+      <w:r>
+        <w:t>Se falhar, abra o job, expanda o step vermelho e use o log para localizar o erro de compilação/teste.</w:t>
+      </w:r>
+    </w:p>
+    <w:p>
+      <w:pPr>
+        <w:pStyle w:val="ListNumber"/>
+      </w:pPr>
+      <w:r>
+        <w:t>Aguarde a revisão e aprovação da proprietária. O assistente não aprova nem faz merge de PRs.</w:t>
+      </w:r>
+    </w:p>
+    <w:p>
+      <w:pPr>
+        <w:pStyle w:val="Heading2"/>
+      </w:pPr>
+      <w:r>
+        <w:t>PR quando Code Scanning estiver habilitado</w:t>
+      </w:r>
+    </w:p>
+    <w:p>
+      <w:pPr>
+        <w:pStyle w:val="ListNumber"/>
+      </w:pPr>
+      <w:r>
+        <w:t>Consulte o check de Code Scanning no PR junto com o build Maven.</w:t>
+      </w:r>
+    </w:p>
+    <w:p>
+      <w:pPr>
+        <w:pStyle w:val="ListNumber"/>
+      </w:pPr>
+      <w:r>
+        <w:t>Abra cada alerta para ver a regra, severidade, arquivo e linha indicados.</w:t>
+      </w:r>
+    </w:p>
+    <w:p>
+      <w:pPr>
+        <w:pStyle w:val="ListNumber"/>
+      </w:pPr>
+      <w:r>
+        <w:t>Corrija no código e envie um novo commit; confirme se a nova análise atualizou ou fechou o alerta.</w:t>
+      </w:r>
+    </w:p>
+    <w:p>
+      <w:pPr>
+        <w:pStyle w:val="ListNumber"/>
+      </w:pPr>
+      <w:r>
+        <w:t>Trate os checks como sinais para revisão. O bloqueio de merge depende da regra de branch configurada pela administração.</w:t>
+      </w:r>
+    </w:p>
+    <w:p>
+      <w:pPr>
+        <w:pStyle w:val="Heading2"/>
+      </w:pPr>
+      <w:r>
+        <w:t>PR automático do Dependabot</w:t>
+      </w:r>
+    </w:p>
+    <w:p>
+      <w:pPr>
+        <w:pStyle w:val="ListNumber"/>
+      </w:pPr>
+      <w:r>
+        <w:t>Confira no diff quais dependências e versões foram alteradas.</w:t>
+      </w:r>
+    </w:p>
+    <w:p>
+      <w:pPr>
+        <w:pStyle w:val="ListNumber"/>
+      </w:pPr>
+      <w:r>
+        <w:t>Leia a descrição do alerta/atualização e examine os checks do PR.</w:t>
+      </w:r>
+    </w:p>
+    <w:p>
+      <w:pPr>
+        <w:pStyle w:val="ListNumber"/>
+      </w:pPr>
+      <w:r>
+        <w:t>Revise compatibilidade e testes como em qualquer PR. Um PR do bot não deve ser aprovado automaticamente neste exercício.</w:t>
+      </w:r>
+    </w:p>
+    <w:p>
+      <w:pPr>
+        <w:pStyle w:val="ListNumber"/>
+      </w:pPr>
+      <w:r>
+        <w:t>Somente a proprietária aprova e faz merge.</w:t>
+      </w:r>
+    </w:p>
+    <w:p>
+      <w:pPr>
+        <w:pStyle w:val="Heading2"/>
+      </w:pPr>
+      <w:r>
+        <w:t>Push protection</w:t>
+      </w:r>
+    </w:p>
+    <w:p>
+      <w:r>
+        <w:t>Se um push for bloqueado por uma possível credencial, não contorne o bloqueio com um segredo real. Remova o valor do código/histórico conforme o caso, use um armazenamento seguro para credenciais e siga o procedimento da organização.</w:t>
+      </w:r>
+    </w:p>
+    <w:p>
+      <w:pPr>
+        <w:pStyle w:val="Heading1"/>
+      </w:pPr>
+      <w:r>
+        <w:t>4. Sequência e registro de aprendizado</w:t>
+      </w:r>
+    </w:p>
+    <w:p>
+      <w:pPr>
+        <w:pStyle w:val="ListNumber"/>
+      </w:pPr>
+      <w:r>
+        <w:t>Aprender o workflow de Actions já ativo.</w:t>
+      </w:r>
+    </w:p>
+    <w:p>
+      <w:pPr>
+        <w:pStyle w:val="ListNumber"/>
+      </w:pPr>
+      <w:r>
+        <w:t>Testar Dependabot isoladamente.</w:t>
+      </w:r>
+    </w:p>
+    <w:p>
+      <w:pPr>
+        <w:pStyle w:val="ListNumber"/>
+      </w:pPr>
+      <w:r>
+        <w:t>Testar Code Scanning/CodeQL isoladamente.</w:t>
+      </w:r>
+    </w:p>
+    <w:p>
+      <w:pPr>
+        <w:pStyle w:val="ListNumber"/>
+      </w:pPr>
+      <w:r>
+        <w:t>Testar Secret Scanning e, se autorizado, Push protection.</w:t>
+      </w:r>
+    </w:p>
+    <w:p>
+      <w:pPr>
+        <w:pStyle w:val="ListNumber"/>
+      </w:pPr>
+      <w:r>
+        <w:t>Consolidar capturas, o que apareceu nos PRs e o que cada papel deve fazer.</w:t>
+      </w:r>
+    </w:p>
+    <w:p>
+      <w:pPr>
+        <w:pStyle w:val="ListNumber"/>
+      </w:pPr>
+      <w:r>
+        <w:t>Reintegrar Sonar por último e comparar os resultados.</w:t>
+      </w:r>
+    </w:p>
+    <w:p>
+      <w:r>
+        <w:t>Cada ativação é uma decisão separada da proprietária. Registre para cada sessão: data, configuração alterada, estado anterior/novo, URL da execução ou PR, resultado observado e captura da tela.</w:t>
+      </w:r>
+    </w:p>
+    <w:p>
+      <w:pPr>
+        <w:pStyle w:val="Heading1"/>
+      </w:pPr>
+      <w:r>
+        <w:t>5. Documentação oficial</w:t>
       </w:r>
     </w:p>
     <w:p>
@@ -124,357 +1538,55 @@
         <w:pStyle w:val="ListBullet"/>
       </w:pPr>
       <w:r>
-        <w:t>Nenhum recurso de GHAS foi habilitado. O PR segue aguardando sua revisão e aprovação; o assistente não aprova nem mescla PRs.</w:t>
+        <w:t>Configurar Dependabot alerts — https://docs.github.com/en/code-security/how-tos/secure-your-supply-chain/secure-your-dependencies/configure-dependabot-alerts</w:t>
       </w:r>
     </w:p>
     <w:p>
       <w:pPr>
-        <w:pStyle w:val="Heading2"/>
+        <w:pStyle w:val="ListBullet"/>
       </w:pPr>
       <w:r>
-        <w:t>Estado observado em Settings &gt; Advanced Security</w:t>
-      </w:r>
-    </w:p>
-    <w:tbl>
-      <w:tblPr>
-        <w:tblStyle w:val="LightShading-Accent1"/>
-        <w:tblW w:type="auto" w:w="0"/>
-        <w:jc w:val="center"/>
-        <w:tblLook w:firstColumn="1" w:firstRow="1" w:lastColumn="0" w:lastRow="0" w:noHBand="0" w:noVBand="1" w:val="04A0"/>
-      </w:tblPr>
-      <w:tblGrid>
-        <w:gridCol w:w="4968"/>
-        <w:gridCol w:w="4968"/>
-      </w:tblGrid>
-      <w:tr>
-        <w:tc>
-          <w:tcPr>
-            <w:tcW w:type="dxa" w:w="4968"/>
-            <w:vAlign w:val="center"/>
-            <w:shd w:fill="DCE8F3"/>
-          </w:tcPr>
-          <w:p>
-            <w:r/>
-            <w:r>
-              <w:rPr>
-                <w:b/>
-              </w:rPr>
-              <w:t>Configuração</w:t>
-            </w:r>
-          </w:p>
-        </w:tc>
-        <w:tc>
-          <w:tcPr>
-            <w:tcW w:type="dxa" w:w="4968"/>
-            <w:vAlign w:val="center"/>
-            <w:shd w:fill="DCE8F3"/>
-          </w:tcPr>
-          <w:p>
-            <w:r/>
-            <w:r>
-              <w:rPr>
-                <w:b/>
-              </w:rPr>
-              <w:t>Estado observado</w:t>
-            </w:r>
-          </w:p>
-        </w:tc>
-      </w:tr>
-      <w:tr>
-        <w:tc>
-          <w:tcPr>
-            <w:tcW w:type="dxa" w:w="4968"/>
-            <w:vAlign w:val="center"/>
-          </w:tcPr>
-          <w:p>
-            <w:r/>
-            <w:r>
-              <w:rPr>
-                <w:b w:val="0"/>
-              </w:rPr>
-              <w:t>Dependency graph</w:t>
-            </w:r>
-          </w:p>
-        </w:tc>
-        <w:tc>
-          <w:tcPr>
-            <w:tcW w:type="dxa" w:w="4968"/>
-            <w:vAlign w:val="center"/>
-          </w:tcPr>
-          <w:p>
-            <w:r/>
-            <w:r>
-              <w:rPr>
-                <w:b w:val="0"/>
-              </w:rPr>
-              <w:t>Off na tela do repositório</w:t>
-            </w:r>
-          </w:p>
-        </w:tc>
-      </w:tr>
-      <w:tr>
-        <w:tc>
-          <w:tcPr>
-            <w:tcW w:type="dxa" w:w="4968"/>
-            <w:vAlign w:val="center"/>
-          </w:tcPr>
-          <w:p>
-            <w:r/>
-            <w:r>
-              <w:rPr>
-                <w:b w:val="0"/>
-              </w:rPr>
-              <w:t>Dependabot alerts</w:t>
-            </w:r>
-          </w:p>
-        </w:tc>
-        <w:tc>
-          <w:tcPr>
-            <w:tcW w:type="dxa" w:w="4968"/>
-            <w:vAlign w:val="center"/>
-          </w:tcPr>
-          <w:p>
-            <w:r/>
-            <w:r>
-              <w:rPr>
-                <w:b w:val="0"/>
-              </w:rPr>
-              <w:t>Off</w:t>
-            </w:r>
-          </w:p>
-        </w:tc>
-      </w:tr>
-      <w:tr>
-        <w:tc>
-          <w:tcPr>
-            <w:tcW w:type="dxa" w:w="4968"/>
-            <w:vAlign w:val="center"/>
-          </w:tcPr>
-          <w:p>
-            <w:r/>
-            <w:r>
-              <w:rPr>
-                <w:b w:val="0"/>
-              </w:rPr>
-              <w:t>Dependabot security updates</w:t>
-            </w:r>
-          </w:p>
-        </w:tc>
-        <w:tc>
-          <w:tcPr>
-            <w:tcW w:type="dxa" w:w="4968"/>
-            <w:vAlign w:val="center"/>
-          </w:tcPr>
-          <w:p>
-            <w:r/>
-            <w:r>
-              <w:rPr>
-                <w:b w:val="0"/>
-              </w:rPr>
-              <w:t>Off</w:t>
-            </w:r>
-          </w:p>
-        </w:tc>
-      </w:tr>
-      <w:tr>
-        <w:tc>
-          <w:tcPr>
-            <w:tcW w:type="dxa" w:w="4968"/>
-            <w:vAlign w:val="center"/>
-          </w:tcPr>
-          <w:p>
-            <w:r/>
-            <w:r>
-              <w:rPr>
-                <w:b w:val="0"/>
-              </w:rPr>
-              <w:t>Grouped security updates</w:t>
-            </w:r>
-          </w:p>
-        </w:tc>
-        <w:tc>
-          <w:tcPr>
-            <w:tcW w:type="dxa" w:w="4968"/>
-            <w:vAlign w:val="center"/>
-          </w:tcPr>
-          <w:p>
-            <w:r/>
-            <w:r>
-              <w:rPr>
-                <w:b w:val="0"/>
-              </w:rPr>
-              <w:t>Off</w:t>
-            </w:r>
-          </w:p>
-        </w:tc>
-      </w:tr>
-      <w:tr>
-        <w:tc>
-          <w:tcPr>
-            <w:tcW w:type="dxa" w:w="4968"/>
-            <w:vAlign w:val="center"/>
-          </w:tcPr>
-          <w:p>
-            <w:r/>
-            <w:r>
-              <w:rPr>
-                <w:b w:val="0"/>
-              </w:rPr>
-              <w:t>Dependabot version updates</w:t>
-            </w:r>
-          </w:p>
-        </w:tc>
-        <w:tc>
-          <w:tcPr>
-            <w:tcW w:type="dxa" w:w="4968"/>
-            <w:vAlign w:val="center"/>
-          </w:tcPr>
-          <w:p>
-            <w:r/>
-            <w:r>
-              <w:rPr>
-                <w:b w:val="0"/>
-              </w:rPr>
-              <w:t>não configurado; dependabot.yml não existe</w:t>
-            </w:r>
-          </w:p>
-        </w:tc>
-      </w:tr>
-      <w:tr>
-        <w:tc>
-          <w:tcPr>
-            <w:tcW w:type="dxa" w:w="4968"/>
-            <w:vAlign w:val="center"/>
-          </w:tcPr>
-          <w:p>
-            <w:r/>
-            <w:r>
-              <w:rPr>
-                <w:b w:val="0"/>
-              </w:rPr>
-              <w:t>CodeQL analysis / Code Scanning</w:t>
-            </w:r>
-          </w:p>
-        </w:tc>
-        <w:tc>
-          <w:tcPr>
-            <w:tcW w:type="dxa" w:w="4968"/>
-            <w:vAlign w:val="center"/>
-          </w:tcPr>
-          <w:p>
-            <w:r/>
-            <w:r>
-              <w:rPr>
-                <w:b w:val="0"/>
-              </w:rPr>
-              <w:t>desligado; a tela oferece “Set up”</w:t>
-            </w:r>
-          </w:p>
-        </w:tc>
-      </w:tr>
-      <w:tr>
-        <w:tc>
-          <w:tcPr>
-            <w:tcW w:type="dxa" w:w="4968"/>
-            <w:vAlign w:val="center"/>
-          </w:tcPr>
-          <w:p>
-            <w:r/>
-            <w:r>
-              <w:rPr>
-                <w:b w:val="0"/>
-              </w:rPr>
-              <w:t>Secret Protection</w:t>
-            </w:r>
-          </w:p>
-        </w:tc>
-        <w:tc>
-          <w:tcPr>
-            <w:tcW w:type="dxa" w:w="4968"/>
-            <w:vAlign w:val="center"/>
-          </w:tcPr>
-          <w:p>
-            <w:r/>
-            <w:r>
-              <w:rPr>
-                <w:b w:val="0"/>
-              </w:rPr>
-              <w:t>desligado; a tela oferece “Enable”</w:t>
-            </w:r>
-          </w:p>
-        </w:tc>
-      </w:tr>
-      <w:tr>
-        <w:tc>
-          <w:tcPr>
-            <w:tcW w:type="dxa" w:w="4968"/>
-            <w:vAlign w:val="center"/>
-          </w:tcPr>
-          <w:p>
-            <w:r/>
-            <w:r>
-              <w:rPr>
-                <w:b w:val="0"/>
-              </w:rPr>
-              <w:t>Copilot Autofix</w:t>
-            </w:r>
-          </w:p>
-        </w:tc>
-        <w:tc>
-          <w:tcPr>
-            <w:tcW w:type="dxa" w:w="4968"/>
-            <w:vAlign w:val="center"/>
-          </w:tcPr>
-          <w:p>
-            <w:r/>
-            <w:r>
-              <w:rPr>
-                <w:b w:val="0"/>
-              </w:rPr>
-              <w:t>On, mas requer CodeQL ativo para sugerir correções; não foi alterado</w:t>
-            </w:r>
-          </w:p>
-        </w:tc>
-      </w:tr>
-    </w:tbl>
-    <w:p>
-      <w:r>
-        <w:t>Em repositórios públicos, o GitHub informa que pode enviar alertas a provedores parceiros quando detecta padrões de segredos. Isso não equivale a habilitar alertas de Secret Scanning para a proprietária. Confira a tela e o plano antes de concluir que toda detecção está ausente.</w:t>
-      </w:r>
-    </w:p>
-    <w:p>
-      <w:r>
-        <w:t xml:space="preserve">Tela verificada: </w:t>
-      </w:r>
-      <w:hyperlink r:id="rId11">
-        <w:r>
-          <w:rPr>
-            <w:color w:val="0563C1"/>
-            <w:u w:val="single"/>
-          </w:rPr>
-          <w:t>Settings &gt; Advanced Security do repositório</w:t>
-        </w:r>
-      </w:hyperlink>
-    </w:p>
-    <w:p>
-      <w:r>
-        <w:rPr>
-          <w:i/>
-        </w:rPr>
-        <w:t>Registro visual: a captura foi exibida durante a verificação no Codex. A imagem não está embutida neste arquivo nesta versão; as próximas atualizações deste guia devem incluir a captura como figura junto à mudança correspondente.</w:t>
+        <w:t>Configurar atualizações de versão do Dependabot — https://docs.github.com/en/code-security/how-tos/secure-your-supply-chain/secure-your-dependencies/configure-version-updates</w:t>
       </w:r>
     </w:p>
     <w:p>
       <w:pPr>
-        <w:pStyle w:val="Heading2"/>
+        <w:pStyle w:val="ListBullet"/>
       </w:pPr>
       <w:r>
-        <w:t>Por que retirar o Sonar agora</w:t>
+        <w:t>Configurar Code Scanning default setup — https://docs.github.com/en/code-security/how-tos/find-and-fix-code-vulnerabilities/configure-code-scanning/configure-code-scanning</w:t>
       </w:r>
     </w:p>
     <w:p>
+      <w:pPr>
+        <w:pStyle w:val="ListBullet"/>
+      </w:pPr>
       <w:r>
-        <w:t>O objetivo didático é separar os sinais. GitHub Actions continua executando build e testes; o SonarQube Cloud era uma etapa adicional, não uma exigência do Actions. Removê-lo do YAML evita misturar o Quality Gate com os checks nativos durante a próxima comparação. A integração Sonar anterior permanece no histórico e a integração local continua no README. O scanner pode ser reintroduzido quando a proprietária pedir.</w:t>
+        <w:t>Tipos de configuração do Code Scanning — https://docs.github.com/en/code-security/concepts/code-scanning/setup-types</w:t>
+      </w:r>
+    </w:p>
+    <w:p>
+      <w:pPr>
+        <w:pStyle w:val="ListBullet"/>
+      </w:pPr>
+      <w:r>
+        <w:t>Habilitar Secret Scanning — https://docs.github.com/en/code-security/how-tos/secure-your-secrets/detect-secret-leaks/enable-secret-scanning</w:t>
+      </w:r>
+    </w:p>
+    <w:p>
+      <w:pPr>
+        <w:pStyle w:val="ListBullet"/>
+      </w:pPr>
+      <w:r>
+        <w:t>Habilitar Push protection — https://docs.github.com/en/code-security/how-tos/secure-your-secrets/prevent-future-leaks/enable-push-protection</w:t>
+      </w:r>
+    </w:p>
+    <w:p>
+      <w:pPr>
+        <w:pStyle w:val="ListBullet"/>
+      </w:pPr>
+      <w:r>
+        <w:t>Quickstart de segurança do GitHub — https://docs.github.com/en/code-security/getting-started/quickstart-for-securing-your-repository</w:t>
       </w:r>
     </w:p>
     <w:p>
@@ -482,52 +1594,7 @@
         <w:pStyle w:val="Heading1"/>
       </w:pPr>
       <w:r>
-        <w:t>2. Para quem desenvolve no repositório</w:t>
-      </w:r>
-    </w:p>
-    <w:p>
-      <w:r>
-        <w:t>Ao abrir um pull request para main, espere o check “Build and test” que compila e roda testes Maven. Falhas aparecem nos logs do job. Nenhuma análise Sonar ou CodeQL será executada pelo workflow após esta alteração.</w:t>
-      </w:r>
-    </w:p>
-    <w:p>
-      <w:pPr>
-        <w:pStyle w:val="Heading2"/>
-      </w:pPr>
-      <w:r>
-        <w:t>Como habilitar cada recurso mais tarde</w:t>
-      </w:r>
-    </w:p>
-    <w:p>
-      <w:pPr>
-        <w:pStyle w:val="ListNumber"/>
-      </w:pPr>
-      <w:r>
-        <w:t>CodeQL / Code Scanning: em Settings &gt; Advanced Security &gt; Code Security &gt; CodeQL analysis, escolha Set up e conclua o default setup. Depois, confira os alertas em Security &gt; Code scanning. Habilite apenas quando a proprietária decidir iniciar essa etapa.</w:t>
-      </w:r>
-    </w:p>
-    <w:p>
-      <w:pPr>
-        <w:pStyle w:val="ListNumber"/>
-      </w:pPr>
-      <w:r>
-        <w:t>Dependabot: habilite primeiro Dependency graph e Dependabot alerts para observar avisos. Security updates pode abrir PRs automáticos para vulnerabilidades com correção disponível. Version updates exigem .github/dependabot.yml com ecossistema, diretório e agenda; eles atualizam versões mesmo sem alerta de vulnerabilidade.</w:t>
-      </w:r>
-    </w:p>
-    <w:p>
-      <w:pPr>
-        <w:pStyle w:val="ListNumber"/>
-      </w:pPr>
-      <w:r>
-        <w:t>Secret Scanning: em Settings &gt; Advanced Security &gt; Secret Protection, use Enable e confirme os recursos exibidos. Dependendo da disponibilidade, isso expõe alertas para segredos versionados e proteção contra push de padrões reconhecidos. Padrões destinados a provedores em repositórios públicos podem ter comportamento automático separado.</w:t>
-      </w:r>
-    </w:p>
-    <w:p>
-      <w:pPr>
-        <w:pStyle w:val="Heading2"/>
-      </w:pPr>
-      <w:r>
-        <w:t>O que esperar no PR</w:t>
+        <w:t>6. Histórico desta trilha</w:t>
       </w:r>
     </w:p>
     <w:p>
@@ -535,7 +1602,18 @@
         <w:pStyle w:val="ListBullet"/>
       </w:pPr>
       <w:r>
-        <w:t>GitHub Actions mostra os jobs e checks definidos em .github/workflows/.</w:t>
+        <w:t xml:space="preserve">O PR #7 remove a execução do Sonar do workflow e mantém Maven </w:t>
+      </w:r>
+      <w:r>
+        <w:rPr>
+          <w:rFonts w:ascii="Consolas" w:hAnsi="Consolas"/>
+          <w:color w:val="5B2C83"/>
+          <w:sz w:val="18"/>
+        </w:rPr>
+        <w:t>verify</w:t>
+      </w:r>
+      <w:r>
+        <w:t>.</w:t>
       </w:r>
     </w:p>
     <w:p>
@@ -543,7 +1621,51 @@
         <w:pStyle w:val="ListBullet"/>
       </w:pPr>
       <w:r>
-        <w:t>Code Scanning publica findings e pode apontar arquivo e linha; o check pode falhar conforme configuração e regras de branch.</w:t>
+        <w:t xml:space="preserve">O workflow usa os eventos </w:t>
+      </w:r>
+      <w:r>
+        <w:rPr>
+          <w:rFonts w:ascii="Consolas" w:hAnsi="Consolas"/>
+          <w:color w:val="5B2C83"/>
+          <w:sz w:val="18"/>
+        </w:rPr>
+        <w:t>push</w:t>
+      </w:r>
+      <w:r>
+        <w:t xml:space="preserve"> para </w:t>
+      </w:r>
+      <w:r>
+        <w:rPr>
+          <w:rFonts w:ascii="Consolas" w:hAnsi="Consolas"/>
+          <w:color w:val="5B2C83"/>
+          <w:sz w:val="18"/>
+        </w:rPr>
+        <w:t>main</w:t>
+      </w:r>
+      <w:r>
+        <w:t xml:space="preserve"> e </w:t>
+      </w:r>
+      <w:r>
+        <w:rPr>
+          <w:rFonts w:ascii="Consolas" w:hAnsi="Consolas"/>
+          <w:color w:val="5B2C83"/>
+          <w:sz w:val="18"/>
+        </w:rPr>
+        <w:t>pull_request</w:t>
+      </w:r>
+      <w:r>
+        <w:t xml:space="preserve"> para </w:t>
+      </w:r>
+      <w:r>
+        <w:rPr>
+          <w:rFonts w:ascii="Consolas" w:hAnsi="Consolas"/>
+          <w:color w:val="5B2C83"/>
+          <w:sz w:val="18"/>
+        </w:rPr>
+        <w:t>main</w:t>
+      </w:r>
+      <w:r>
+        <w:t>.</w:t>
       </w:r>
     </w:p>
     <w:p>
@@ -551,7 +1673,7 @@
         <w:pStyle w:val="ListBullet"/>
       </w:pPr>
       <w:r>
-        <w:t>Dependabot atua em manifests/dependências e abre alertas e/ou PRs automáticos conforme os recursos ligados.</w:t>
+        <w:t>As ferramentas de GHAS continuam desligadas conforme o escopo acordado.</w:t>
       </w:r>
     </w:p>
     <w:p>
@@ -559,181 +1681,14 @@
         <w:pStyle w:val="ListBullet"/>
       </w:pPr>
       <w:r>
-        <w:t>Secret Scanning procura padrões de credenciais reconhecidos; push protection pode bloquear um envio antes de chegar ao repositório, quando habilitado e disponível.</w:t>
+        <w:t>A proprietária revisa e aprova PRs. O assistente não aprova nem mescla.</w:t>
       </w:r>
-    </w:p>
-    <w:p>
-      <w:pPr>
-        <w:pStyle w:val="ListBullet"/>
-      </w:pPr>
-      <w:r>
-        <w:t>SonarQube Cloud é uma análise separada que pode produzir Quality Gate; não está ativo neste workflow durante esta fase.</w:t>
-      </w:r>
-    </w:p>
-    <w:p>
-      <w:pPr>
-        <w:pStyle w:val="Heading1"/>
-      </w:pPr>
-      <w:r>
-        <w:t>Próximos passos acordados</w:t>
-      </w:r>
-    </w:p>
-    <w:p>
-      <w:pPr>
-        <w:pStyle w:val="ListNumber"/>
-      </w:pPr>
-      <w:r>
-        <w:t>Você revisa e aprova o PR #7. O assistente não aprova nem mescla PRs.</w:t>
-      </w:r>
-    </w:p>
-    <w:p>
-      <w:pPr>
-        <w:pStyle w:val="ListNumber"/>
-      </w:pPr>
-      <w:r>
-        <w:t>Após sua aprovação e o merge, observamos um PR com somente build/teste do GitHub Actions.</w:t>
-      </w:r>
-    </w:p>
-    <w:p>
-      <w:pPr>
-        <w:pStyle w:val="ListNumber"/>
-      </w:pPr>
-      <w:r>
-        <w:t>Com autorização em cada etapa, habilitamos Dependabot, CodeQL e Secret Scanning separadamente e registramos as respectivas telas.</w:t>
-      </w:r>
-    </w:p>
-    <w:p>
-      <w:pPr>
-        <w:pStyle w:val="ListNumber"/>
-      </w:pPr>
-      <w:r>
-        <w:t>O Sonar volta somente quando você pedir, para comparar a interação com os checks do GitHub.</w:t>
-      </w:r>
-    </w:p>
-    <w:p>
-      <w:pPr>
-        <w:pStyle w:val="Heading1"/>
-      </w:pPr>
-      <w:r>
-        <w:t>Fontes oficiais</w:t>
-      </w:r>
-    </w:p>
-    <w:p>
-      <w:pPr>
-        <w:pStyle w:val="ListBullet"/>
-      </w:pPr>
-      <w:hyperlink r:id="rId12">
-        <w:r>
-          <w:rPr>
-            <w:color w:val="0563C1"/>
-            <w:u w:val="single"/>
-          </w:rPr>
-          <w:t>GitHub — Code scanning setup types</w:t>
-        </w:r>
-      </w:hyperlink>
-    </w:p>
-    <w:p>
-      <w:pPr>
-        <w:pStyle w:val="ListBullet"/>
-      </w:pPr>
-      <w:hyperlink r:id="rId13">
-        <w:r>
-          <w:rPr>
-            <w:color w:val="0563C1"/>
-            <w:u w:val="single"/>
-          </w:rPr>
-          <w:t>GitHub — configurar Code Scanning</w:t>
-        </w:r>
-      </w:hyperlink>
-    </w:p>
-    <w:p>
-      <w:pPr>
-        <w:pStyle w:val="ListBullet"/>
-      </w:pPr>
-      <w:hyperlink r:id="rId14">
-        <w:r>
-          <w:rPr>
-            <w:color w:val="0563C1"/>
-            <w:u w:val="single"/>
-          </w:rPr>
-          <w:t>GitHub — Dependabot alerts</w:t>
-        </w:r>
-      </w:hyperlink>
-    </w:p>
-    <w:p>
-      <w:pPr>
-        <w:pStyle w:val="ListBullet"/>
-      </w:pPr>
-      <w:hyperlink r:id="rId15">
-        <w:r>
-          <w:rPr>
-            <w:color w:val="0563C1"/>
-            <w:u w:val="single"/>
-          </w:rPr>
-          <w:t>GitHub — version updates</w:t>
-        </w:r>
-      </w:hyperlink>
-    </w:p>
-    <w:p>
-      <w:pPr>
-        <w:pStyle w:val="ListBullet"/>
-      </w:pPr>
-      <w:hyperlink r:id="rId16">
-        <w:r>
-          <w:rPr>
-            <w:color w:val="0563C1"/>
-            <w:u w:val="single"/>
-          </w:rPr>
-          <w:t>GitHub — habilitar Secret Scanning</w:t>
-        </w:r>
-      </w:hyperlink>
-    </w:p>
-    <w:p>
-      <w:pPr>
-        <w:pStyle w:val="ListBullet"/>
-      </w:pPr>
-      <w:hyperlink r:id="rId17">
-        <w:r>
-          <w:rPr>
-            <w:color w:val="0563C1"/>
-            <w:u w:val="single"/>
-          </w:rPr>
-          <w:t>GitHub — quickstart de segurança</w:t>
-        </w:r>
-      </w:hyperlink>
-    </w:p>
-    <w:p>
-      <w:pPr>
-        <w:pStyle w:val="Heading1"/>
-      </w:pPr>
-      <w:r>
-        <w:t>Resultado registrado no GitHub</w:t>
-      </w:r>
-    </w:p>
-    <w:p>
-      <w:r>
-        <w:t>Após o commit c852b11, o GitHub executou o workflow Build and test via pull_request. O job “Build and test with Maven” terminou com Success em 25 segundos. O workflow desse commit não executou Sonar. Este resultado foi adicionado ao guia depois da execução automática.</w:t>
-      </w:r>
-    </w:p>
-    <w:p>
-      <w:r>
-        <w:t xml:space="preserve">Abrir a execução: </w:t>
-      </w:r>
-      <w:hyperlink r:id="rId18">
-        <w:r>
-          <w:rPr>
-            <w:color w:val="0563C1"/>
-            <w:u w:val="single"/>
-          </w:rPr>
-          <w:t>GitHub Actions — execução do PR #7</w:t>
-        </w:r>
-      </w:hyperlink>
     </w:p>
     <w:sectPr>
       <w:headerReference w:type="default" r:id="rId9"/>
       <w:footerReference w:type="default" r:id="rId10"/>
       <w:pgSz w:w="12240" w:h="15840"/>
-      <w:pgMar w:top="1008" w:right="1152" w:bottom="1008" w:left="1152" w:header="720" w:footer="720" w:gutter="0"/>
+      <w:pgMar w:top="979" w:right="1123" w:bottom="979" w:left="1123" w:header="720" w:footer="720" w:gutter="0"/>
       <w:cols w:space="720"/>
       <w:docGrid w:linePitch="360"/>
     </w:sectPr>
@@ -749,7 +1704,7 @@
       <w:jc w:val="center"/>
     </w:pPr>
     <w:r>
-      <w:t>Material de aprendizado • 10/10/2026 • PR #7 aguarda revisão da proprietária</w:t>
+      <w:t>Trilha de aprendizado • Atualizado em 10/10/2026</w:t>
     </w:r>
   </w:p>
 </w:ftr>
@@ -759,10 +1714,11 @@
 <w:hdr xmlns:m="http://schemas.openxmlformats.org/officeDocument/2006/math" xmlns:mc="http://schemas.openxmlformats.org/markup-compatibility/2006" xmlns:mo="http://schemas.microsoft.com/office/mac/office/2008/main" xmlns:mv="urn:schemas-microsoft-com:mac:vml" xmlns:o="urn:schemas-microsoft-com:office:office" xmlns:r="http://schemas.openxmlformats.org/officeDocument/2006/relationships" xmlns:v="urn:schemas-microsoft-com:vml" xmlns:w10="urn:schemas-microsoft-com:office:word" xmlns:w14="http://schemas.microsoft.com/office/word/2010/wordml" xmlns:w="http://schemas.openxmlformats.org/wordprocessingml/2006/main" xmlns:wne="http://schemas.microsoft.com/office/word/2006/wordml" xmlns:wp14="http://schemas.microsoft.com/office/word/2010/wordprocessingDrawing" xmlns:wp="http://schemas.openxmlformats.org/drawingml/2006/wordprocessingDrawing" xmlns:wpc="http://schemas.microsoft.com/office/word/2010/wordprocessingCanvas" xmlns:wpg="http://schemas.microsoft.com/office/word/2010/wordprocessingGroup" xmlns:wpi="http://schemas.microsoft.com/office/word/2010/wordprocessingInk" xmlns:wps="http://schemas.microsoft.com/office/word/2010/wordprocessingShape" mc:Ignorable="w14 wp14">
   <w:p>
     <w:pPr>
-      <w:pStyle w:val="Header"/>
+      <w:pStyle w:val="Caption"/>
+      <w:jc w:val="right"/>
     </w:pPr>
     <w:r>
-      <w:t>SOM &amp; CORDA  /  GUIA DE SEGURANÇA E CI</w:t>
+      <w:t>SOM &amp; CORDA  |  GUIA OPERACIONAL</w:t>
     </w:r>
   </w:p>
 </w:hdr>
@@ -1131,9 +2087,11 @@
     <w:name w:val="Normal"/>
     <w:qFormat/>
     <w:rsid w:val="00FC693F"/>
+    <w:pPr>
+      <w:spacing w:after="100"/>
+    </w:pPr>
     <w:rPr>
       <w:rFonts w:ascii="Aptos" w:hAnsi="Aptos"/>
-      <w:color w:val="2A3648"/>
       <w:sz w:val="20"/>
     </w:rPr>
   </w:style>
@@ -1196,11 +2154,11 @@
       <w:outlineLvl w:val="0"/>
     </w:pPr>
     <w:rPr>
-      <w:rFonts w:asciiTheme="majorHAnsi" w:eastAsiaTheme="majorEastAsia" w:hAnsiTheme="majorHAnsi" w:cstheme="majorBidi" w:ascii="Aptos" w:hAnsi="Aptos"/>
+      <w:rFonts w:asciiTheme="majorHAnsi" w:eastAsiaTheme="majorEastAsia" w:hAnsiTheme="majorHAnsi" w:cstheme="majorBidi" w:ascii="Aptos Display" w:hAnsi="Aptos Display"/>
       <w:b/>
       <w:bCs/>
-      <w:color w:val="183153"/>
-      <w:sz w:val="36"/>
+      <w:color w:val="14365D"/>
+      <w:sz w:val="32"/>
       <w:szCs w:val="28"/>
     </w:rPr>
   </w:style>
@@ -1220,11 +2178,11 @@
       <w:outlineLvl w:val="1"/>
     </w:pPr>
     <w:rPr>
-      <w:rFonts w:asciiTheme="majorHAnsi" w:eastAsiaTheme="majorEastAsia" w:hAnsiTheme="majorHAnsi" w:cstheme="majorBidi" w:ascii="Aptos" w:hAnsi="Aptos"/>
+      <w:rFonts w:asciiTheme="majorHAnsi" w:eastAsiaTheme="majorEastAsia" w:hAnsiTheme="majorHAnsi" w:cstheme="majorBidi" w:ascii="Aptos Display" w:hAnsi="Aptos Display"/>
       <w:b/>
       <w:bCs/>
-      <w:color w:val="276678"/>
-      <w:sz w:val="26"/>
+      <w:color w:val="0070C0"/>
+      <w:sz w:val="24"/>
       <w:szCs w:val="26"/>
     </w:rPr>
   </w:style>
@@ -1485,12 +2443,12 @@
       <w:contextualSpacing/>
     </w:pPr>
     <w:rPr>
-      <w:rFonts w:asciiTheme="majorHAnsi" w:eastAsiaTheme="majorEastAsia" w:hAnsiTheme="majorHAnsi" w:cstheme="majorBidi" w:ascii="Aptos" w:hAnsi="Aptos"/>
+      <w:rFonts w:asciiTheme="majorHAnsi" w:eastAsiaTheme="majorEastAsia" w:hAnsiTheme="majorHAnsi" w:cstheme="majorBidi" w:ascii="Aptos Display" w:hAnsi="Aptos Display"/>
       <w:b/>
-      <w:color w:val="183153"/>
+      <w:color w:val="14365D"/>
       <w:spacing w:val="5"/>
       <w:kern w:val="28"/>
-      <w:sz w:val="52"/>
+      <w:sz w:val="46"/>
       <w:szCs w:val="52"/>
     </w:rPr>
   </w:style>

</xml_diff>

<commit_message>
Refresh Actions run evidence in security guide
</commit_message>
<xml_diff>
--- a/docs/guia-github-actions-e-seguranca.docx
+++ b/docs/guia-github-actions-e-seguranca.docx
@@ -743,7 +743,7 @@
       <w:r>
         <w:drawing>
           <wp:inline xmlns:a="http://schemas.openxmlformats.org/drawingml/2006/main" xmlns:pic="http://schemas.openxmlformats.org/drawingml/2006/picture">
-            <wp:extent cx="5806440" cy="4429484"/>
+            <wp:extent cx="5806440" cy="4429069"/>
             <wp:docPr id="4" name="Picture 4"/>
             <wp:cNvGraphicFramePr>
               <a:graphicFrameLocks noChangeAspect="1"/>
@@ -764,7 +764,7 @@
                   <pic:spPr>
                     <a:xfrm>
                       <a:off x="0" y="0"/>
-                      <a:ext cx="5806440" cy="4429484"/>
+                      <a:ext cx="5806440" cy="4429069"/>
                     </a:xfrm>
                     <a:prstGeom prst="rect"/>
                   </pic:spPr>
@@ -1673,6 +1673,31 @@
         <w:pStyle w:val="ListBullet"/>
       </w:pPr>
       <w:r>
+        <w:t xml:space="preserve">Após a atualização deste guia, a execução </w:t>
+      </w:r>
+      <w:r>
+        <w:t>#21 do Actions — https://github.com/aeroschmidt/scanner-loja-instrumentos/actions/runs/38094010130</w:t>
+      </w:r>
+      <w:r>
+        <w:t xml:space="preserve"> passou em 27 segundos no evento </w:t>
+      </w:r>
+      <w:r>
+        <w:rPr>
+          <w:rFonts w:ascii="Consolas" w:hAnsi="Consolas"/>
+          <w:color w:val="5B2C83"/>
+          <w:sz w:val="18"/>
+        </w:rPr>
+        <w:t>pull_request</w:t>
+      </w:r>
+      <w:r>
+        <w:t>.</w:t>
+      </w:r>
+    </w:p>
+    <w:p>
+      <w:pPr>
+        <w:pStyle w:val="ListBullet"/>
+      </w:pPr>
+      <w:r>
         <w:t>As ferramentas de GHAS continuam desligadas conforme o escopo acordado.</w:t>
       </w:r>
     </w:p>

</xml_diff>

<commit_message>
Document PR 9 checks and CodeQL state
</commit_message>
<xml_diff>
--- a/docs/guia-github-actions-e-seguranca.docx
+++ b/docs/guia-github-actions-e-seguranca.docx
@@ -869,16 +869,16 @@
         <w:pStyle w:val="ListNumber"/>
       </w:pPr>
       <w:r>
-        <w:t xml:space="preserve">Abra </w:t>
+        <w:t xml:space="preserve">Abra o job </w:t>
       </w:r>
       <w:r>
         <w:rPr>
           <w:b/>
         </w:rPr>
-        <w:t>Build, test, and analyze with SonarQube</w:t>
+        <w:t>Build and test with Maven</w:t>
       </w:r>
       <w:r>
-        <w:t xml:space="preserve"> apenas em execuções históricas; no workflow atual, o step executa </w:t>
+        <w:t xml:space="preserve"> e expanda os steps para acompanhar cada etapa; o comando Maven executado é </w:t>
       </w:r>
       <w:r>
         <w:rPr>
@@ -1709,6 +1709,293 @@
         <w:t>A proprietária revisa e aprova PRs. O assistente não aprova nem mescla.</w:t>
       </w:r>
     </w:p>
+    <w:p>
+      <w:pPr>
+        <w:pStyle w:val="Heading1"/>
+      </w:pPr>
+      <w:r>
+        <w:t>7. Demonstração: PR #9 com Code Scanning desligado</w:t>
+      </w:r>
+    </w:p>
+    <w:p>
+      <w:r>
+        <w:rPr>
+          <w:b/>
+        </w:rPr>
+        <w:t>PR:</w:t>
+      </w:r>
+      <w:r>
+        <w:t xml:space="preserve"> </w:t>
+      </w:r>
+      <w:r>
+        <w:t>Demonstração controlada de SQL Injection — https://github.com/aeroschmidt/scanner-loja-instrumentos/pull/9</w:t>
+      </w:r>
+    </w:p>
+    <w:p>
+      <w:r>
+        <w:rPr>
+          <w:b/>
+        </w:rPr>
+        <w:t>Branch:</w:t>
+      </w:r>
+      <w:r>
+        <w:t xml:space="preserve"> </w:t>
+      </w:r>
+      <w:r>
+        <w:rPr>
+          <w:rFonts w:ascii="Consolas" w:hAnsi="Consolas"/>
+          <w:color w:val="5B2C83"/>
+          <w:sz w:val="18"/>
+        </w:rPr>
+        <w:t>demo/vulnerabilidade-sql-sem-code-scanning</w:t>
+      </w:r>
+    </w:p>
+    <w:p>
+      <w:r>
+        <w:rPr>
+          <w:b/>
+        </w:rPr>
+        <w:t>Commit:</w:t>
+      </w:r>
+      <w:r>
+        <w:t xml:space="preserve"> </w:t>
+      </w:r>
+      <w:r>
+        <w:rPr>
+          <w:rFonts w:ascii="Consolas" w:hAnsi="Consolas"/>
+          <w:color w:val="5B2C83"/>
+          <w:sz w:val="18"/>
+        </w:rPr>
+        <w:t>32da6b1</w:t>
+      </w:r>
+      <w:r>
+        <w:t xml:space="preserve"> — mensagem assinada e verificada pelo GitHub.</w:t>
+      </w:r>
+    </w:p>
+    <w:p>
+      <w:r>
+        <w:t xml:space="preserve">Este PR foi criado para comparar a compilação do Actions com a análise de segurança do CodeQL. Ele adiciona uma rota isolada de demonstração que monta uma consulta SQL concatenando a entrada </w:t>
+      </w:r>
+      <w:r>
+        <w:rPr>
+          <w:rFonts w:ascii="Consolas" w:hAnsi="Consolas"/>
+          <w:color w:val="5B2C83"/>
+          <w:sz w:val="18"/>
+        </w:rPr>
+        <w:t>name</w:t>
+      </w:r>
+      <w:r>
+        <w:t>. A rota comum de busca continua usando consulta parametrizada. O código vulnerável existe apenas para o exercício e não deve ser mesclado nem usado em produção.</w:t>
+      </w:r>
+    </w:p>
+    <w:p>
+      <w:pPr>
+        <w:pStyle w:val="Heading2"/>
+      </w:pPr>
+      <w:r>
+        <w:t>Resultado observado</w:t>
+      </w:r>
+    </w:p>
+    <w:p>
+      <w:pPr>
+        <w:pStyle w:val="ListBullet"/>
+      </w:pPr>
+      <w:r>
+        <w:t xml:space="preserve">O workflow </w:t>
+      </w:r>
+      <w:r>
+        <w:rPr>
+          <w:b/>
+        </w:rPr>
+        <w:t>Build and test with Maven</w:t>
+      </w:r>
+      <w:r>
+        <w:t xml:space="preserve"> concluiu com sucesso no PR. Isso confirma que o projeto compilou e que os testes executados por Maven passaram; não confirma que o código é seguro.</w:t>
+      </w:r>
+    </w:p>
+    <w:p>
+      <w:pPr>
+        <w:pStyle w:val="ListBullet"/>
+      </w:pPr>
+      <w:r>
+        <w:t>O CodeQL / Code Scanning permaneceu desligado, conforme solicitado. Por isso, o GitHub não executou a análise CodeQL e não mostrou alerta de vulnerabilidade nesse PR.</w:t>
+      </w:r>
+    </w:p>
+    <w:p>
+      <w:pPr>
+        <w:pStyle w:val="ListBullet"/>
+      </w:pPr>
+      <w:r>
+        <w:t>A ausência do alerta é esperada porque o analisador estava desligado. Não é evidência de que o código vulnerável tenha passado por uma análise estática.</w:t>
+      </w:r>
+    </w:p>
+    <w:p>
+      <w:pPr>
+        <w:pStyle w:val="ListBullet"/>
+      </w:pPr>
+      <w:r>
+        <w:t>Não há reviewer atribuído: a revisão está pendente da mantenedora. Dependabot não é revisor humano; quando habilitado, pode abrir PRs de dependências, que ainda precisam de revisão.</w:t>
+      </w:r>
+    </w:p>
+    <w:p>
+      <w:pPr>
+        <w:pStyle w:val="ListBullet"/>
+      </w:pPr>
+      <w:r>
+        <w:t>A mantenedora decide se aprova e mescla. O assistente não aprova nem mescla PRs.</w:t>
+      </w:r>
+    </w:p>
+    <w:p>
+      <w:r>
+        <w:rPr>
+          <w:b/>
+        </w:rPr>
+        <w:t>Evidências no GitHub:</w:t>
+      </w:r>
+      <w:r>
+        <w:t xml:space="preserve"> </w:t>
+      </w:r>
+      <w:r>
+        <w:t>conversa e descrição do PR #9 — https://github.com/aeroschmidt/scanner-loja-instrumentos/pull/9</w:t>
+      </w:r>
+      <w:r>
+        <w:t xml:space="preserve">, </w:t>
+      </w:r>
+      <w:r>
+        <w:t>checks do PR #9 — https://github.com/aeroschmidt/scanner-loja-instrumentos/pull/9/checks</w:t>
+      </w:r>
+      <w:r>
+        <w:t xml:space="preserve"> e </w:t>
+      </w:r>
+      <w:r>
+        <w:t>execução do Actions #25 — https://github.com/aeroschmidt/scanner-loja-instrumentos/actions/runs/38097282398</w:t>
+      </w:r>
+      <w:r>
+        <w:t>. A Captura 4 é uma execução anterior do workflow, no PR #7; use os links do PR #9 para ver o resultado desta demonstração.</w:t>
+      </w:r>
+    </w:p>
+    <w:p>
+      <w:pPr>
+        <w:pStyle w:val="Heading2"/>
+      </w:pPr>
+      <w:r>
+        <w:t>Como ler este PR</w:t>
+      </w:r>
+    </w:p>
+    <w:p>
+      <w:pPr>
+        <w:pStyle w:val="ListNumber"/>
+      </w:pPr>
+      <w:r>
+        <w:t xml:space="preserve">Na conversa, leia </w:t>
+      </w:r>
+      <w:r>
+        <w:rPr>
+          <w:b/>
+        </w:rPr>
+        <w:t>Objetivo</w:t>
+      </w:r>
+      <w:r>
+        <w:t xml:space="preserve">, </w:t>
+      </w:r>
+      <w:r>
+        <w:rPr>
+          <w:b/>
+        </w:rPr>
+        <w:t>Alteração</w:t>
+      </w:r>
+      <w:r>
+        <w:t xml:space="preserve">, </w:t>
+      </w:r>
+      <w:r>
+        <w:rPr>
+          <w:b/>
+        </w:rPr>
+        <w:t>O que observar</w:t>
+      </w:r>
+      <w:r>
+        <w:t xml:space="preserve"> e </w:t>
+      </w:r>
+      <w:r>
+        <w:rPr>
+          <w:b/>
+        </w:rPr>
+        <w:t>Revisão</w:t>
+      </w:r>
+      <w:r>
+        <w:t xml:space="preserve"> antes de olhar os checks.</w:t>
+      </w:r>
+    </w:p>
+    <w:p>
+      <w:pPr>
+        <w:pStyle w:val="ListNumber"/>
+      </w:pPr>
+      <w:r>
+        <w:t xml:space="preserve">Em </w:t>
+      </w:r>
+      <w:r>
+        <w:rPr>
+          <w:b/>
+        </w:rPr>
+        <w:t>Checks</w:t>
+      </w:r>
+      <w:r>
+        <w:t>, confirme que o job do Maven terminou com sucesso. Um check verde quer dizer que aquele job passou, dentro do que ele executa.</w:t>
+      </w:r>
+    </w:p>
+    <w:p>
+      <w:pPr>
+        <w:pStyle w:val="ListNumber"/>
+      </w:pPr>
+      <w:r>
+        <w:t xml:space="preserve">Compare a lista de checks com o que está habilitado em </w:t>
+      </w:r>
+      <w:r>
+        <w:rPr>
+          <w:b/>
+        </w:rPr>
+        <w:t>Settings &gt; Advanced Security</w:t>
+      </w:r>
+      <w:r>
+        <w:t>. Como CodeQL está desligado, não espere check nem alerta Code Scanning.</w:t>
+      </w:r>
+    </w:p>
+    <w:p>
+      <w:pPr>
+        <w:pStyle w:val="ListNumber"/>
+      </w:pPr>
+      <w:r>
+        <w:t xml:space="preserve">Em </w:t>
+      </w:r>
+      <w:r>
+        <w:rPr>
+          <w:b/>
+        </w:rPr>
+        <w:t>Files changed</w:t>
+      </w:r>
+      <w:r>
+        <w:t>, identifique a rota de demonstração e confirme que a busca normal permanece parametrizada.</w:t>
+      </w:r>
+    </w:p>
+    <w:p>
+      <w:pPr>
+        <w:pStyle w:val="ListNumber"/>
+      </w:pPr>
+      <w:r>
+        <w:t>Não aprove nem mescle este PR enquanto a rota vulnerável estiver presente. A mantenedora deve decidir o próximo passo do exercício.</w:t>
+      </w:r>
+    </w:p>
+    <w:p>
+      <w:r>
+        <w:rPr>
+          <w:b/>
+        </w:rPr>
+        <w:t>Nota sobre a branch:</w:t>
+      </w:r>
+      <w:r>
+        <w:t xml:space="preserve"> o nome atual identifica que este é um exercício isolado e que Code Scanning está desligado. Mantivemos a branch para preservar o PR #9 aberto e seus checks; a tentativa de renomeá-la pelo GitHub avisou que fecharia o PR.</w:t>
+      </w:r>
+    </w:p>
     <w:sectPr>
       <w:headerReference w:type="default" r:id="rId9"/>
       <w:footerReference w:type="default" r:id="rId10"/>

</xml_diff>

<commit_message>
Document SQL injection before and after CodeQL
</commit_message>
<xml_diff>
--- a/docs/guia-github-actions-e-seguranca.docx
+++ b/docs/guia-github-actions-e-seguranca.docx
@@ -1879,6 +1879,315 @@
         <w:pStyle w:val="Heading2"/>
       </w:pPr>
       <w:r>
+        <w:t>Antes e depois: trecho que Code Scanning deve examinar</w:t>
+      </w:r>
+    </w:p>
+    <w:p>
+      <w:r>
+        <w:t xml:space="preserve">As duas figuras abaixo são visualizações legíveis dos trechos reais de </w:t>
+      </w:r>
+      <w:r>
+        <w:rPr>
+          <w:rFonts w:ascii="Consolas" w:hAnsi="Consolas"/>
+          <w:color w:val="5B2C83"/>
+          <w:sz w:val="18"/>
+        </w:rPr>
+        <w:t>ProductRepository.java</w:t>
+      </w:r>
+      <w:r>
+        <w:t xml:space="preserve">, comparando </w:t>
+      </w:r>
+      <w:r>
+        <w:rPr>
+          <w:rFonts w:ascii="Consolas" w:hAnsi="Consolas"/>
+          <w:color w:val="5B2C83"/>
+          <w:sz w:val="18"/>
+        </w:rPr>
+        <w:t>main</w:t>
+      </w:r>
+      <w:r>
+        <w:t xml:space="preserve"> com o código introduzido no PR #9. Elas não são capturas da interface do GitHub. O diff original e as linhas verificáveis estão em </w:t>
+      </w:r>
+      <w:r>
+        <w:t>Files changed no PR #9 — https://github.com/aeroschmidt/scanner-loja-instrumentos/pull/9/files</w:t>
+      </w:r>
+      <w:r>
+        <w:t>.</w:t>
+      </w:r>
+    </w:p>
+    <w:p>
+      <w:r>
+        <w:rPr>
+          <w:b/>
+        </w:rPr>
+        <w:t>Antes — `main`, linhas 32–36: busca parametrizada.</w:t>
+      </w:r>
+      <w:r>
+        <w:t xml:space="preserve"> O </w:t>
+      </w:r>
+      <w:r>
+        <w:rPr>
+          <w:rFonts w:ascii="Consolas" w:hAnsi="Consolas"/>
+          <w:color w:val="5B2C83"/>
+          <w:sz w:val="18"/>
+        </w:rPr>
+        <w:t>?</w:t>
+      </w:r>
+      <w:r>
+        <w:t xml:space="preserve"> ocupa o lugar do valor; </w:t>
+      </w:r>
+      <w:r>
+        <w:rPr>
+          <w:rFonts w:ascii="Consolas" w:hAnsi="Consolas"/>
+          <w:color w:val="5B2C83"/>
+          <w:sz w:val="18"/>
+        </w:rPr>
+        <w:t>name</w:t>
+      </w:r>
+      <w:r>
+        <w:t xml:space="preserve"> é passado separadamente como parâmetro. Isso evita montar SQL com o conteúdo recebido.</w:t>
+      </w:r>
+    </w:p>
+    <w:p>
+      <w:pPr>
+        <w:jc w:val="center"/>
+      </w:pPr>
+      <w:r>
+        <w:drawing>
+          <wp:inline xmlns:a="http://schemas.openxmlformats.org/drawingml/2006/main" xmlns:pic="http://schemas.openxmlformats.org/drawingml/2006/picture">
+            <wp:extent cx="5806440" cy="1664513"/>
+            <wp:docPr id="5" name="Picture 5"/>
+            <wp:cNvGraphicFramePr>
+              <a:graphicFrameLocks noChangeAspect="1"/>
+            </wp:cNvGraphicFramePr>
+            <a:graphic>
+              <a:graphicData uri="http://schemas.openxmlformats.org/drawingml/2006/picture">
+                <pic:pic>
+                  <pic:nvPicPr>
+                    <pic:cNvPr id="0" name="05-antes-busca-parametrizada.png"/>
+                    <pic:cNvPicPr/>
+                  </pic:nvPicPr>
+                  <pic:blipFill>
+                    <a:blip r:embed="rId15"/>
+                    <a:stretch>
+                      <a:fillRect/>
+                    </a:stretch>
+                  </pic:blipFill>
+                  <pic:spPr>
+                    <a:xfrm>
+                      <a:off x="0" y="0"/>
+                      <a:ext cx="5806440" cy="1664513"/>
+                    </a:xfrm>
+                    <a:prstGeom prst="rect"/>
+                  </pic:spPr>
+                </pic:pic>
+              </a:graphicData>
+            </a:graphic>
+          </wp:inline>
+        </w:drawing>
+      </w:r>
+    </w:p>
+    <w:p>
+      <w:pPr>
+        <w:pStyle w:val="Caption"/>
+        <w:jc w:val="center"/>
+      </w:pPr>
+      <w:r>
+        <w:t>Visualização do código antes: busca parametrizada na main, ProductRepository.java linhas 32 a 36</w:t>
+      </w:r>
+    </w:p>
+    <w:p>
+      <w:r>
+        <w:rPr>
+          <w:b/>
+        </w:rPr>
+        <w:t>Depois — PR #9, linhas 39–42: SQL Injection demonstrativa.</w:t>
+      </w:r>
+      <w:r>
+        <w:t xml:space="preserve"> A entrada externa chega pelo parâmetro </w:t>
+      </w:r>
+      <w:r>
+        <w:rPr>
+          <w:rFonts w:ascii="Consolas" w:hAnsi="Consolas"/>
+          <w:color w:val="5B2C83"/>
+          <w:sz w:val="18"/>
+        </w:rPr>
+        <w:t>name</w:t>
+      </w:r>
+      <w:r>
+        <w:t xml:space="preserve"> em </w:t>
+      </w:r>
+      <w:r>
+        <w:rPr>
+          <w:rFonts w:ascii="Consolas" w:hAnsi="Consolas"/>
+          <w:color w:val="5B2C83"/>
+          <w:sz w:val="18"/>
+        </w:rPr>
+        <w:t>ProductController.java</w:t>
+      </w:r>
+      <w:r>
+        <w:t xml:space="preserve">, linha 38. </w:t>
+      </w:r>
+      <w:r>
+        <w:rPr>
+          <w:rFonts w:ascii="Consolas" w:hAnsi="Consolas"/>
+          <w:color w:val="5B2C83"/>
+          <w:sz w:val="18"/>
+        </w:rPr>
+        <w:t>ProductRepository.java</w:t>
+      </w:r>
+      <w:r>
+        <w:t xml:space="preserve">, linha 41, concatena esse valor dentro da instrução SQL; a linha 42 envia a consulta montada para </w:t>
+      </w:r>
+      <w:r>
+        <w:rPr>
+          <w:rFonts w:ascii="Consolas" w:hAnsi="Consolas"/>
+          <w:color w:val="5B2C83"/>
+          <w:sz w:val="18"/>
+        </w:rPr>
+        <w:t>JdbcTemplate.query</w:t>
+      </w:r>
+      <w:r>
+        <w:t xml:space="preserve">. A rota de demonstração é </w:t>
+      </w:r>
+      <w:r>
+        <w:rPr>
+          <w:rFonts w:ascii="Consolas" w:hAnsi="Consolas"/>
+          <w:color w:val="5B2C83"/>
+          <w:sz w:val="18"/>
+        </w:rPr>
+        <w:t>/api/products/demo/sql-injection</w:t>
+      </w:r>
+      <w:r>
+        <w:t xml:space="preserve"> (linhas 37–40 do controller).</w:t>
+      </w:r>
+    </w:p>
+    <w:p>
+      <w:pPr>
+        <w:jc w:val="center"/>
+      </w:pPr>
+      <w:r>
+        <w:drawing>
+          <wp:inline xmlns:a="http://schemas.openxmlformats.org/drawingml/2006/main" xmlns:pic="http://schemas.openxmlformats.org/drawingml/2006/picture">
+            <wp:extent cx="5806440" cy="1664513"/>
+            <wp:docPr id="6" name="Picture 6"/>
+            <wp:cNvGraphicFramePr>
+              <a:graphicFrameLocks noChangeAspect="1"/>
+            </wp:cNvGraphicFramePr>
+            <a:graphic>
+              <a:graphicData uri="http://schemas.openxmlformats.org/drawingml/2006/picture">
+                <pic:pic>
+                  <pic:nvPicPr>
+                    <pic:cNvPr id="0" name="06-depois-concatenacao-sql.png"/>
+                    <pic:cNvPicPr/>
+                  </pic:nvPicPr>
+                  <pic:blipFill>
+                    <a:blip r:embed="rId16"/>
+                    <a:stretch>
+                      <a:fillRect/>
+                    </a:stretch>
+                  </pic:blipFill>
+                  <pic:spPr>
+                    <a:xfrm>
+                      <a:off x="0" y="0"/>
+                      <a:ext cx="5806440" cy="1664513"/>
+                    </a:xfrm>
+                    <a:prstGeom prst="rect"/>
+                  </pic:spPr>
+                </pic:pic>
+              </a:graphicData>
+            </a:graphic>
+          </wp:inline>
+        </w:drawing>
+      </w:r>
+    </w:p>
+    <w:p>
+      <w:pPr>
+        <w:pStyle w:val="Caption"/>
+        <w:jc w:val="center"/>
+      </w:pPr>
+      <w:r>
+        <w:t>Visualização do código depois: concatenação SQL no PR 9, ProductRepository.java linhas 39 a 42</w:t>
+      </w:r>
+    </w:p>
+    <w:p>
+      <w:r>
+        <w:rPr>
+          <w:b/>
+        </w:rPr>
+        <w:t>O que esperamos observar quando Code Scanning for ligado:</w:t>
+      </w:r>
+      <w:r>
+        <w:t xml:space="preserve"> se o CodeQL reconhecer o fluxo da entrada </w:t>
+      </w:r>
+      <w:r>
+        <w:rPr>
+          <w:rFonts w:ascii="Consolas" w:hAnsi="Consolas"/>
+          <w:color w:val="5B2C83"/>
+          <w:sz w:val="18"/>
+        </w:rPr>
+        <w:t>name</w:t>
+      </w:r>
+      <w:r>
+        <w:t xml:space="preserve"> até a consulta SQL, deverá registrar um alerta de SQL Injection associado ao trecho vulnerável, com arquivo, linha e explicação. O PR atual não confirma essa detecção: CodeQL está desligado. O resultado verde existente é somente do Maven; a compilação não detecta essa falha de segurança.</w:t>
+      </w:r>
+    </w:p>
+    <w:p>
+      <w:r>
+        <w:rPr>
+          <w:b/>
+        </w:rPr>
+        <w:t>“A análise encontrou” e “o PR bloqueou” são resultados diferentes.</w:t>
+      </w:r>
+      <w:r>
+        <w:t xml:space="preserve"> Um alerta/anotação ajuda a localizar o problema no diff. Para impedir merge, a administração também precisa exigir o check de Code Scanning nas regras de proteção da branch. Com CodeQL desligado, nem alerta nem check do CodeQL são esperados neste PR. Consulte </w:t>
+      </w:r>
+      <w:r>
+        <w:t>alertas de Code Scanning — https://docs.github.com/en/code-security/concepts/code-scanning/code-scanning-alerts</w:t>
+      </w:r>
+      <w:r>
+        <w:t xml:space="preserve">, </w:t>
+      </w:r>
+      <w:r>
+        <w:t>alertas em pull requests — https://docs.github.com/en/code-security/how-tos/manage-security-alerts/manage-code-scanning-alerts/triage-alerts-in-pull-requests</w:t>
+      </w:r>
+      <w:r>
+        <w:t xml:space="preserve"> e </w:t>
+      </w:r>
+      <w:r>
+        <w:t>checks obrigatórios — https://docs.github.com/en/pull-requests/reference/status-checks</w:t>
+      </w:r>
+      <w:r>
+        <w:t>.</w:t>
+      </w:r>
+    </w:p>
+    <w:p>
+      <w:r>
+        <w:rPr>
+          <w:b/>
+        </w:rPr>
+        <w:t>Versão segura de referência:</w:t>
+      </w:r>
+      <w:r>
+        <w:t xml:space="preserve"> mantenha a consulta parametrizada, como em </w:t>
+      </w:r>
+      <w:r>
+        <w:rPr>
+          <w:rFonts w:ascii="Consolas" w:hAnsi="Consolas"/>
+          <w:color w:val="5B2C83"/>
+          <w:sz w:val="18"/>
+        </w:rPr>
+        <w:t>searchByName</w:t>
+      </w:r>
+      <w:r>
+        <w:t xml:space="preserve"> nas linhas 32–36. Ao encerrar a demonstração, remova a rota e o método inseguros; não copie esse trecho para uma aplicação real.</w:t>
+      </w:r>
+    </w:p>
+    <w:p>
+      <w:pPr>
+        <w:pStyle w:val="Heading2"/>
+      </w:pPr>
+      <w:r>
         <w:t>Como ler este PR</w:t>
       </w:r>
     </w:p>
@@ -1974,7 +2283,18 @@
         <w:t>Files changed</w:t>
       </w:r>
       <w:r>
-        <w:t>, identifique a rota de demonstração e confirme que a busca normal permanece parametrizada.</w:t>
+        <w:t xml:space="preserve">, localize </w:t>
+      </w:r>
+      <w:r>
+        <w:rPr>
+          <w:rFonts w:ascii="Consolas" w:hAnsi="Consolas"/>
+          <w:color w:val="5B2C83"/>
+          <w:sz w:val="18"/>
+        </w:rPr>
+        <w:t>ProductRepository.java</w:t>
+      </w:r>
+      <w:r>
+        <w:t xml:space="preserve"> nas linhas 39–42 e compare com a busca segura nas linhas 32–36. A visualização lado a lado acima resume essa alteração.</w:t>
       </w:r>
     </w:p>
     <w:p>

</xml_diff>

<commit_message>
Document CodeQL alert dismissal behavior
</commit_message>
<xml_diff>
--- a/docs/guia-github-actions-e-seguranca.docx
+++ b/docs/guia-github-actions-e-seguranca.docx
@@ -48,12 +48,12 @@
         <w:t>Registro de estado:</w:t>
       </w:r>
       <w:r>
-        <w:t xml:space="preserve"> 10 de outubro de 2026</w:t>
+        <w:t xml:space="preserve"> 10 de outubro de 2026; atualização do Code Scanning após o PR #10</w:t>
       </w:r>
     </w:p>
     <w:p>
       <w:r>
-        <w:t>Este guia registra o que está ativo, o que ainda está desligado e como cada participante acompanha os testes. A sequência será uma ferramenta por vez. Nenhuma ferramenta de GHAS é habilitada por este documento.</w:t>
+        <w:t>Este guia registra o que está ativo, o que ainda está desligado e como cada participante acompanha os testes. A sequência é uma ferramenta por vez. A mantenedora habilitou Code Scanning antes do PR #10; este documento registra o estado observado e não altera configurações.</w:t>
       </w:r>
     </w:p>
     <w:p>
@@ -394,7 +394,7 @@
           </w:tcPr>
           <w:p>
             <w:r>
-              <w:t>Off</w:t>
+              <w:t>On, Default setup</w:t>
             </w:r>
           </w:p>
         </w:tc>
@@ -405,7 +405,7 @@
           </w:tcPr>
           <w:p>
             <w:r>
-              <w:t xml:space="preserve">Settings oferece </w:t>
+              <w:t xml:space="preserve">Analisou o PR #10 e encontrou um alerta High de SQL Injection em </w:t>
             </w:r>
             <w:r>
               <w:rPr>
@@ -413,10 +413,10 @@
                 <w:color w:val="5B2C83"/>
                 <w:sz w:val="18"/>
               </w:rPr>
-              <w:t>Set up</w:t>
+              <w:t>ProductRepository.java:42</w:t>
             </w:r>
             <w:r>
-              <w:t>; não está escaneando o código.</w:t>
+              <w:t>.</w:t>
             </w:r>
           </w:p>
         </w:tc>
@@ -568,7 +568,7 @@
         <w:rPr>
           <w:b/>
         </w:rPr>
-        <w:t>Captura 2 — Dependabot e CodeQL:</w:t>
+        <w:t>Captura 2 — estado histórico anterior ao PR #10:</w:t>
       </w:r>
       <w:r>
         <w:t xml:space="preserve"> opções de atualização do Dependabot desligadas e CodeQL aguardando </w:t>
@@ -582,7 +582,7 @@
         <w:t>Set up</w:t>
       </w:r>
       <w:r>
-        <w:t>.</w:t>
+        <w:t>. A configuração atual do CodeQL está ativa via Default setup, conforme o resultado do PR #10 registrado adiante.</w:t>
       </w:r>
     </w:p>
     <w:p>
@@ -1099,7 +1099,7 @@
         <w:pStyle w:val="Heading2"/>
       </w:pPr>
       <w:r>
-        <w:t>C. Code Scanning com CodeQL — etapa separada</w:t>
+        <w:t>C. Code Scanning com CodeQL — habilitado para o teste atual</w:t>
       </w:r>
     </w:p>
     <w:p>
@@ -1107,13 +1107,22 @@
         <w:pStyle w:val="ListNumber"/>
       </w:pPr>
       <w:r>
-        <w:t xml:space="preserve">Abra </w:t>
+        <w:t xml:space="preserve">A mantenedora ativou </w:t>
       </w:r>
       <w:r>
         <w:rPr>
           <w:b/>
         </w:rPr>
-        <w:t>Settings &gt; Advanced Security &gt; Code Security &gt; CodeQL analysis &gt; Set up</w:t>
+        <w:t>Default setup</w:t>
+      </w:r>
+      <w:r>
+        <w:t xml:space="preserve"> em </w:t>
+      </w:r>
+      <w:r>
+        <w:rPr>
+          <w:b/>
+        </w:rPr>
+        <w:t>Settings &gt; Advanced Security &gt; Code Security &gt; CodeQL analysis</w:t>
       </w:r>
       <w:r>
         <w:t>.</w:t>
@@ -1124,16 +1133,7 @@
         <w:pStyle w:val="ListNumber"/>
       </w:pPr>
       <w:r>
-        <w:t xml:space="preserve">Prefira </w:t>
-      </w:r>
-      <w:r>
-        <w:rPr>
-          <w:b/>
-        </w:rPr>
-        <w:t>Default setup</w:t>
-      </w:r>
-      <w:r>
-        <w:t xml:space="preserve"> para este teste inicial. Revise as linguagens que o GitHub detectou e a configuração proposta.</w:t>
+        <w:t>O GitHub identificou linguagens do repositório e executou a análise no PR #10.</w:t>
       </w:r>
     </w:p>
     <w:p>
@@ -1141,16 +1141,7 @@
         <w:pStyle w:val="ListNumber"/>
       </w:pPr>
       <w:r>
-        <w:t xml:space="preserve">Confirme </w:t>
-      </w:r>
-      <w:r>
-        <w:rPr>
-          <w:b/>
-        </w:rPr>
-        <w:t>Enable CodeQL</w:t>
-      </w:r>
-      <w:r>
-        <w:t xml:space="preserve"> somente quando este teste for autorizado.</w:t>
+        <w:t>O resultado deste exercício é um alerta High de SQL Injection com arquivo e linha; consulte o guia do usuário para ver capturas e entender o que o autor e revisor do PR devem fazer.</w:t>
       </w:r>
     </w:p>
     <w:p>
@@ -1158,32 +1149,7 @@
         <w:pStyle w:val="ListNumber"/>
       </w:pPr>
       <w:r>
-        <w:t xml:space="preserve">Aguarde a primeira análise e consulte </w:t>
-      </w:r>
-      <w:r>
-        <w:rPr>
-          <w:b/>
-        </w:rPr>
-        <w:t>Security &gt; Code scanning</w:t>
-      </w:r>
-      <w:r>
-        <w:t>.</w:t>
-      </w:r>
-    </w:p>
-    <w:p>
-      <w:pPr>
-        <w:pStyle w:val="ListNumber"/>
-      </w:pPr>
-      <w:r>
-        <w:t>Em um PR de teste autorizado, confira alertas, arquivo/linha, explicação, severidade e o check de Code Scanning.</w:t>
-      </w:r>
-    </w:p>
-    <w:p>
-      <w:pPr>
-        <w:pStyle w:val="ListNumber"/>
-      </w:pPr>
-      <w:r>
-        <w:t>Registre que falhar um check só bloqueia merge quando as regras de proteção da branch exigirem esse check.</w:t>
+        <w:t>Um alerta no painel e o status do check são coisas diferentes. Só há bloqueio de merge quando as regras de proteção da branch exigem o check apropriado.</w:t>
       </w:r>
     </w:p>
     <w:p>
@@ -1466,6 +1432,182 @@
     </w:p>
     <w:p>
       <w:pPr>
+        <w:pStyle w:val="Heading2"/>
+      </w:pPr>
+      <w:r>
+        <w:t>Dispensa de alertas de Code Scanning</w:t>
+      </w:r>
+    </w:p>
+    <w:p>
+      <w:r>
+        <w:t xml:space="preserve">Se a pessoa tem permissão de escrita no repositório, a interface normalmente oferece </w:t>
+      </w:r>
+      <w:r>
+        <w:rPr>
+          <w:b/>
+        </w:rPr>
+        <w:t>Dismiss alert</w:t>
+      </w:r>
+      <w:r>
+        <w:t xml:space="preserve">, independentemente de o alerta ser High ou Critical. A severidade informa a gravidade; ela não concede nem remove permissões. No alerta High observado no PR #10, o botão abriu um formulário que exige uma razão. As opções mostradas foram </w:t>
+      </w:r>
+      <w:r>
+        <w:rPr>
+          <w:rFonts w:ascii="Consolas" w:hAnsi="Consolas"/>
+          <w:color w:val="5B2C83"/>
+          <w:sz w:val="18"/>
+        </w:rPr>
+        <w:t>False positive</w:t>
+      </w:r>
+      <w:r>
+        <w:t xml:space="preserve">, </w:t>
+      </w:r>
+      <w:r>
+        <w:rPr>
+          <w:rFonts w:ascii="Consolas" w:hAnsi="Consolas"/>
+          <w:color w:val="5B2C83"/>
+          <w:sz w:val="18"/>
+        </w:rPr>
+        <w:t>Used in tests</w:t>
+      </w:r>
+      <w:r>
+        <w:t xml:space="preserve">, </w:t>
+      </w:r>
+      <w:r>
+        <w:rPr>
+          <w:rFonts w:ascii="Consolas" w:hAnsi="Consolas"/>
+          <w:color w:val="5B2C83"/>
+          <w:sz w:val="18"/>
+        </w:rPr>
+        <w:t>Won't fix</w:t>
+      </w:r>
+      <w:r>
+        <w:t xml:space="preserve"> e </w:t>
+      </w:r>
+      <w:r>
+        <w:rPr>
+          <w:rFonts w:ascii="Consolas" w:hAnsi="Consolas"/>
+          <w:color w:val="5B2C83"/>
+          <w:sz w:val="18"/>
+        </w:rPr>
+        <w:t>Mitigated</w:t>
+      </w:r>
+      <w:r>
+        <w:t>. Nenhuma foi selecionada e o alerta continua aberto.</w:t>
+      </w:r>
+    </w:p>
+    <w:p>
+      <w:r>
+        <w:t xml:space="preserve">Dispensar fecha o alerta no painel, registra a razão e não corrige o código. Para uma vulnerabilidade real, a ação esperada é corrigir o código e aguardar nova análise. Configure </w:t>
+      </w:r>
+      <w:r>
+        <w:rPr>
+          <w:b/>
+        </w:rPr>
+        <w:t>delegated alert dismissal</w:t>
+      </w:r>
+      <w:r>
+        <w:t xml:space="preserve"> somente se a política exigir controle adicional: pessoas com acesso de escrita passam a solicitar a dispensa, e proprietários da organização/security managers podem aprovar ou rejeitar. A opção delegada não foi ativada neste exercício.</w:t>
+      </w:r>
+    </w:p>
+    <w:p>
+      <w:pPr>
+        <w:jc w:val="center"/>
+      </w:pPr>
+      <w:r>
+        <w:drawing>
+          <wp:inline xmlns:a="http://schemas.openxmlformats.org/drawingml/2006/main" xmlns:pic="http://schemas.openxmlformats.org/drawingml/2006/picture">
+            <wp:extent cx="5806440" cy="3266991"/>
+            <wp:docPr id="5" name="Picture 5"/>
+            <wp:cNvGraphicFramePr>
+              <a:graphicFrameLocks noChangeAspect="1"/>
+            </wp:cNvGraphicFramePr>
+            <a:graphic>
+              <a:graphicData uri="http://schemas.openxmlformats.org/drawingml/2006/picture">
+                <pic:pic>
+                  <pic:nvPicPr>
+                    <pic:cNvPr id="0" name="pr10-alert-detail-final.jpg"/>
+                    <pic:cNvPicPr/>
+                  </pic:nvPicPr>
+                  <pic:blipFill>
+                    <a:blip r:embed="rId15"/>
+                    <a:stretch>
+                      <a:fillRect/>
+                    </a:stretch>
+                  </pic:blipFill>
+                  <pic:spPr>
+                    <a:xfrm>
+                      <a:off x="0" y="0"/>
+                      <a:ext cx="5806440" cy="3266991"/>
+                    </a:xfrm>
+                    <a:prstGeom prst="rect"/>
+                  </pic:spPr>
+                </pic:pic>
+              </a:graphicData>
+            </a:graphic>
+          </wp:inline>
+        </w:drawing>
+      </w:r>
+    </w:p>
+    <w:p>
+      <w:pPr>
+        <w:pStyle w:val="Caption"/>
+        <w:jc w:val="center"/>
+      </w:pPr>
+      <w:r>
+        <w:t>Alerta High aberto no PR #10, com a localização em ProductRepository.java</w:t>
+      </w:r>
+    </w:p>
+    <w:p>
+      <w:pPr>
+        <w:jc w:val="center"/>
+      </w:pPr>
+      <w:r>
+        <w:drawing>
+          <wp:inline xmlns:a="http://schemas.openxmlformats.org/drawingml/2006/main" xmlns:pic="http://schemas.openxmlformats.org/drawingml/2006/picture">
+            <wp:extent cx="5806440" cy="3266122"/>
+            <wp:docPr id="6" name="Picture 6"/>
+            <wp:cNvGraphicFramePr>
+              <a:graphicFrameLocks noChangeAspect="1"/>
+            </wp:cNvGraphicFramePr>
+            <a:graphic>
+              <a:graphicData uri="http://schemas.openxmlformats.org/drawingml/2006/picture">
+                <pic:pic>
+                  <pic:nvPicPr>
+                    <pic:cNvPr id="0" name="pr10-dismiss-reasons.jpg"/>
+                    <pic:cNvPicPr/>
+                  </pic:nvPicPr>
+                  <pic:blipFill>
+                    <a:blip r:embed="rId16"/>
+                    <a:stretch>
+                      <a:fillRect/>
+                    </a:stretch>
+                  </pic:blipFill>
+                  <pic:spPr>
+                    <a:xfrm>
+                      <a:off x="0" y="0"/>
+                      <a:ext cx="5806440" cy="3266122"/>
+                    </a:xfrm>
+                    <a:prstGeom prst="rect"/>
+                  </pic:spPr>
+                </pic:pic>
+              </a:graphicData>
+            </a:graphic>
+          </wp:inline>
+        </w:drawing>
+      </w:r>
+    </w:p>
+    <w:p>
+      <w:pPr>
+        <w:pStyle w:val="Caption"/>
+        <w:jc w:val="center"/>
+      </w:pPr>
+      <w:r>
+        <w:t>Formulário de dispensa com razões disponíveis; nenhuma foi enviada</w:t>
+      </w:r>
+    </w:p>
+    <w:p>
+      <w:pPr>
         <w:pStyle w:val="Heading1"/>
       </w:pPr>
       <w:r>
@@ -1563,6 +1705,22 @@
       </w:pPr>
       <w:r>
         <w:t>Tipos de configuração do Code Scanning — https://docs.github.com/en/code-security/concepts/code-scanning/setup-types</w:t>
+      </w:r>
+    </w:p>
+    <w:p>
+      <w:pPr>
+        <w:pStyle w:val="ListBullet"/>
+      </w:pPr>
+      <w:r>
+        <w:t>Resolver alertas de Code Scanning e dispensá-los — https://docs.github.com/en/code-security/how-tos/manage-security-alerts/manage-code-scanning-alerts/resolve-alerts</w:t>
+      </w:r>
+    </w:p>
+    <w:p>
+      <w:pPr>
+        <w:pStyle w:val="ListBullet"/>
+      </w:pPr>
+      <w:r>
+        <w:t>Aprovação delegada de dispensas — https://docs.github.com/en/code-security/concepts/security-at-scale/delegated-alert-dismissal</w:t>
       </w:r>
     </w:p>
     <w:p>
@@ -1698,7 +1856,7 @@
         <w:pStyle w:val="ListBullet"/>
       </w:pPr>
       <w:r>
-        <w:t>As ferramentas de GHAS continuam desligadas conforme o escopo acordado.</w:t>
+        <w:t>Code Scanning/CodeQL está ativo via Default setup para o exercício; Dependabot e Secret Protection continuam desligados conforme o escopo.</w:t>
       </w:r>
     </w:p>
     <w:p>
@@ -1729,7 +1887,7 @@
       <w:jc w:val="center"/>
     </w:pPr>
     <w:r>
-      <w:t>Trilha de aprendizado • Atualizado em 10/10/2026</w:t>
+      <w:t>Fluxo de contribuição e verificações de segurança no GitHub</w:t>
     </w:r>
   </w:p>
 </w:ftr>
@@ -1743,7 +1901,7 @@
       <w:jc w:val="right"/>
     </w:pPr>
     <w:r>
-      <w:t>SOM &amp; CORDA  |  GUIA OPERACIONAL</w:t>
+      <w:t>GUIA DO USUÁRIO  |  PULL REQUESTS E VERIFICAÇÕES</w:t>
     </w:r>
   </w:p>
 </w:hdr>

</xml_diff>

<commit_message>
Remove Sonar from workflow and guides
</commit_message>
<xml_diff>
--- a/docs/guia-github-actions-e-seguranca.docx
+++ b/docs/guia-github-actions-e-seguranca.docx
@@ -48,12 +48,12 @@
         <w:t>Registro de estado:</w:t>
       </w:r>
       <w:r>
-        <w:t xml:space="preserve"> 10 de outubro de 2026; atualização do Code Scanning após o PR #10</w:t>
+        <w:t xml:space="preserve"> 10 de outubro de 2026</w:t>
       </w:r>
     </w:p>
     <w:p>
       <w:r>
-        <w:t>Este guia registra o que está ativo, o que ainda está desligado e como cada participante acompanha os testes. A sequência é uma ferramenta por vez. A mantenedora habilitou Code Scanning antes do PR #10; este documento registra o estado observado e não altera configurações.</w:t>
+        <w:t>Este guia registra o que está ativo, o que ainda está desligado e como cada participante acompanha os testes. O PR #10 continua aberto e contém uma SQL Injection intencional; esta documentação registra o estado observado, não aprova nem integra a alteração.</w:t>
       </w:r>
     </w:p>
     <w:p>
@@ -209,52 +209,6 @@
             </w:r>
             <w:r>
               <w:t>.</w:t>
-            </w:r>
-          </w:p>
-        </w:tc>
-      </w:tr>
-      <w:tr>
-        <w:tc>
-          <w:tcPr>
-            <w:tcW w:type="dxa" w:w="3331"/>
-            <w:vAlign w:val="center"/>
-          </w:tcPr>
-          <w:p>
-            <w:r>
-              <w:t>Sonar no workflow</w:t>
-            </w:r>
-          </w:p>
-        </w:tc>
-        <w:tc>
-          <w:tcPr>
-            <w:tcW w:type="dxa" w:w="3331"/>
-            <w:vAlign w:val="center"/>
-          </w:tcPr>
-          <w:p>
-            <w:r>
-              <w:t>Removido nesta etapa</w:t>
-            </w:r>
-          </w:p>
-        </w:tc>
-        <w:tc>
-          <w:tcPr>
-            <w:tcW w:type="dxa" w:w="3331"/>
-            <w:vAlign w:val="center"/>
-          </w:tcPr>
-          <w:p>
-            <w:r>
-              <w:t xml:space="preserve">O workflow não chama Sonar nem lê </w:t>
-            </w:r>
-            <w:r>
-              <w:rPr>
-                <w:rFonts w:ascii="Consolas" w:hAnsi="Consolas"/>
-                <w:color w:val="5B2C83"/>
-                <w:sz w:val="18"/>
-              </w:rPr>
-              <w:t>SONAR_TOKEN</w:t>
-            </w:r>
-            <w:r>
-              <w:t>. A análise local continua descrita no README.</w:t>
             </w:r>
           </w:p>
         </w:tc>
@@ -814,24 +768,7 @@
         <w:t>Actions</w:t>
       </w:r>
       <w:r>
-        <w:t xml:space="preserve"> (a execução bem-sucedida está na Captura 4).</w:t>
-      </w:r>
-    </w:p>
-    <w:p>
-      <w:pPr>
-        <w:pStyle w:val="ListNumber"/>
-      </w:pPr>
-      <w:r>
-        <w:t xml:space="preserve">Abra uma execução do workflow </w:t>
-      </w:r>
-      <w:r>
-        <w:rPr>
-          <w:b/>
-        </w:rPr>
-        <w:t>Build and test</w:t>
-      </w:r>
-      <w:r>
-        <w:t>.</w:t>
+        <w:t>. Consulte a execução associada ao PR que estiver avaliando.</w:t>
       </w:r>
     </w:p>
     <w:p>
@@ -847,21 +784,10 @@
           <w:color w:val="5B2C83"/>
           <w:sz w:val="18"/>
         </w:rPr>
-        <w:t>push</w:t>
-      </w:r>
-      <w:r>
-        <w:t xml:space="preserve"> ou </w:t>
-      </w:r>
-      <w:r>
-        <w:rPr>
-          <w:rFonts w:ascii="Consolas" w:hAnsi="Consolas"/>
-          <w:color w:val="5B2C83"/>
-          <w:sz w:val="18"/>
-        </w:rPr>
         <w:t>pull_request</w:t>
       </w:r>
       <w:r>
-        <w:t>), o job e seus steps.</w:t>
+        <w:t>), o job e os steps.</w:t>
       </w:r>
     </w:p>
     <w:p>
@@ -869,35 +795,7 @@
         <w:pStyle w:val="ListNumber"/>
       </w:pPr>
       <w:r>
-        <w:t xml:space="preserve">Abra </w:t>
-      </w:r>
-      <w:r>
-        <w:rPr>
-          <w:b/>
-        </w:rPr>
-        <w:t>Build, test, and analyze with SonarQube</w:t>
-      </w:r>
-      <w:r>
-        <w:t xml:space="preserve"> apenas em execuções históricas; no workflow atual, o step executa </w:t>
-      </w:r>
-      <w:r>
-        <w:rPr>
-          <w:rFonts w:ascii="Consolas" w:hAnsi="Consolas"/>
-          <w:color w:val="5B2C83"/>
-          <w:sz w:val="18"/>
-        </w:rPr>
-        <w:t>./mvnw --batch-mode --no-transfer-progress verify</w:t>
-      </w:r>
-      <w:r>
-        <w:t>.</w:t>
-      </w:r>
-    </w:p>
-    <w:p>
-      <w:pPr>
-        <w:pStyle w:val="ListNumber"/>
-      </w:pPr>
-      <w:r>
-        <w:t xml:space="preserve">Em </w:t>
+        <w:t xml:space="preserve">O arquivo </w:t>
       </w:r>
       <w:r>
         <w:rPr>
@@ -908,12 +806,31 @@
         <w:t>build.yml</w:t>
       </w:r>
       <w:r>
-        <w:t>, identifique os gatilhos, o runner, a preparação do Java, o cache Maven e o comando de build. A execução recente registrada concluiu com sucesso.</w:t>
+        <w:t xml:space="preserve"> prepara Java 21 e executa </w:t>
+      </w:r>
+      <w:r>
+        <w:rPr>
+          <w:rFonts w:ascii="Consolas" w:hAnsi="Consolas"/>
+          <w:color w:val="5B2C83"/>
+          <w:sz w:val="18"/>
+        </w:rPr>
+        <w:t>./mvnw ... verify</w:t>
+      </w:r>
+      <w:r>
+        <w:t xml:space="preserve"> para compilar e testar.</w:t>
+      </w:r>
+    </w:p>
+    <w:p>
+      <w:pPr>
+        <w:pStyle w:val="ListNumber"/>
+      </w:pPr>
+      <w:r>
+        <w:t>Inspecione o log do job para conferir o que foi executado e localizar a primeira mensagem de falha, se houver.</w:t>
       </w:r>
     </w:p>
     <w:p>
       <w:r>
-        <w:t>O Actions coordena o workflow; Maven compila o projeto e roda os testes. Um check de Actions não significa que CodeQL, Dependabot ou Secret Scanning estejam ativos.</w:t>
+        <w:t>O Actions coordena o workflow e o Maven compila e testa. Uma execução verde confirma apenas os passos configurados nesse workflow; a análise CodeQL é uma verificação separada.</w:t>
       </w:r>
     </w:p>
     <w:p>
@@ -1226,30 +1143,6 @@
     <w:p>
       <w:r>
         <w:t>Regras e disponibilidade de funcionalidades dependem de visibilidade e plano do repositório. Em repositórios públicos, o GitHub informa que envia alertas de padrões de parceiros aos provedores correspondentes; isso não deve ser confundido com a configuração dos alertas privados para a proprietária.</w:t>
-      </w:r>
-    </w:p>
-    <w:p>
-      <w:pPr>
-        <w:pStyle w:val="Heading2"/>
-      </w:pPr>
-      <w:r>
-        <w:t>E. Depois dos testes: Sonar por último</w:t>
-      </w:r>
-    </w:p>
-    <w:p>
-      <w:r>
-        <w:t xml:space="preserve">Quando Dependabot, CodeQL e Secret Scanning tiverem sido testados e registrados, a última etapa será reintroduzir Sonar no workflow. Então poderemos comparar checks nativos do GitHub com a análise e o Quality Gate do Sonar. Até lá, o workflow não usa </w:t>
-      </w:r>
-      <w:r>
-        <w:rPr>
-          <w:rFonts w:ascii="Consolas" w:hAnsi="Consolas"/>
-          <w:color w:val="5B2C83"/>
-          <w:sz w:val="18"/>
-        </w:rPr>
-        <w:t>SONAR_TOKEN</w:t>
-      </w:r>
-      <w:r>
-        <w:t>.</w:t>
       </w:r>
     </w:p>
     <w:p>
@@ -1651,15 +1544,7 @@
         <w:pStyle w:val="ListNumber"/>
       </w:pPr>
       <w:r>
-        <w:t>Consolidar capturas, o que apareceu nos PRs e o que cada papel deve fazer.</w:t>
-      </w:r>
-    </w:p>
-    <w:p>
-      <w:pPr>
-        <w:pStyle w:val="ListNumber"/>
-      </w:pPr>
-      <w:r>
-        <w:t>Reintegrar Sonar por último e comparar os resultados.</w:t>
+        <w:t>Registrar estado inicial, configuração alterada e evidências de cada etapa, sem misturar os resultados do build com os alertas de segurança.</w:t>
       </w:r>
     </w:p>
     <w:p>
@@ -1760,7 +1645,7 @@
         <w:pStyle w:val="ListBullet"/>
       </w:pPr>
       <w:r>
-        <w:t xml:space="preserve">O PR #7 remove a execução do Sonar do workflow e mantém Maven </w:t>
+        <w:t xml:space="preserve">O workflow executa Maven </w:t>
       </w:r>
       <w:r>
         <w:rPr>
@@ -1771,7 +1656,7 @@
         <w:t>verify</w:t>
       </w:r>
       <w:r>
-        <w:t>.</w:t>
+        <w:t>; a análise CodeQL é configurada separadamente nas opções de segurança do repositório.</w:t>
       </w:r>
     </w:p>
     <w:p>
@@ -1779,7 +1664,7 @@
         <w:pStyle w:val="ListBullet"/>
       </w:pPr>
       <w:r>
-        <w:t xml:space="preserve">O workflow usa os eventos </w:t>
+        <w:t xml:space="preserve">O workflow da branch do PR #10 usa </w:t>
       </w:r>
       <w:r>
         <w:rPr>
@@ -1812,7 +1697,7 @@
         <w:t>pull_request</w:t>
       </w:r>
       <w:r>
-        <w:t xml:space="preserve"> para </w:t>
+        <w:t xml:space="preserve"> destinado a </w:t>
       </w:r>
       <w:r>
         <w:rPr>
@@ -1887,7 +1772,7 @@
       <w:jc w:val="center"/>
     </w:pPr>
     <w:r>
-      <w:t>Fluxo de contribuição e verificações de segurança no GitHub</w:t>
+      <w:t>Administração de Actions e segurança no GitHub</w:t>
     </w:r>
   </w:p>
 </w:ftr>
@@ -1901,7 +1786,7 @@
       <w:jc w:val="right"/>
     </w:pPr>
     <w:r>
-      <w:t>GUIA DO USUÁRIO  |  PULL REQUESTS E VERIFICAÇÕES</w:t>
+      <w:t>MANTENEDORA  |  AÇÕES E SEGURANÇA</w:t>
     </w:r>
   </w:p>
 </w:hdr>

</xml_diff>

<commit_message>
Document alert triage and Actions concurrency
</commit_message>
<xml_diff>
--- a/docs/guia-github-actions-e-seguranca.docx
+++ b/docs/guia-github-actions-e-seguranca.docx
@@ -834,6 +834,22 @@
       </w:r>
     </w:p>
     <w:p>
+      <w:r>
+        <w:t xml:space="preserve">Cada novo push ou atualização de PR pode iniciar outra execução. O GitHub permite execuções simultâneas por padrão. Quando a capacidade de runners hospedados é atingida, os jobs novos aguardam na fila; eles não falham apenas porque várias pessoas enviaram commits. Se a equipe configurar </w:t>
+      </w:r>
+      <w:r>
+        <w:rPr>
+          <w:rFonts w:ascii="Consolas" w:hAnsi="Consolas"/>
+          <w:color w:val="5B2C83"/>
+          <w:sz w:val="18"/>
+        </w:rPr>
+        <w:t>concurrency</w:t>
+      </w:r>
+      <w:r>
+        <w:t xml:space="preserve"> com cancelamento, execuções anteriores da mesma fila podem ser canceladas intencionalmente. Ao investigar um resultado, confira sempre o SHA do commit associado ao check para não confundir a execução de um commit antigo com a mais recente.</w:t>
+      </w:r>
+    </w:p>
+    <w:p>
       <w:pPr>
         <w:pStyle w:val="Heading2"/>
       </w:pPr>
@@ -1333,7 +1349,16 @@
     </w:p>
     <w:p>
       <w:r>
-        <w:t xml:space="preserve">Se a pessoa tem permissão de escrita no repositório, a interface normalmente oferece </w:t>
+        <w:t xml:space="preserve">Não é qualquer pessoa que fez um commit: no padrão atual, quem tem </w:t>
+      </w:r>
+      <w:r>
+        <w:rPr>
+          <w:b/>
+        </w:rPr>
+        <w:t>permissão de escrita no repositório</w:t>
+      </w:r>
+      <w:r>
+        <w:t xml:space="preserve"> pode ver e usar </w:t>
       </w:r>
       <w:r>
         <w:rPr>
@@ -1391,7 +1416,21 @@
     </w:p>
     <w:p>
       <w:r>
-        <w:t xml:space="preserve">Dispensar fecha o alerta no painel, registra a razão e não corrige o código. Para uma vulnerabilidade real, a ação esperada é corrigir o código e aguardar nova análise. Configure </w:t>
+        <w:t xml:space="preserve">Boa prática: primeiro entenda a regra e o caminho indicado, confirme se o achado é real e corrija a causa no código; rode testes e aguarde a nova análise. Não dispense um alerta real só para liberar o PR ou deixar o check verde. Use </w:t>
+      </w:r>
+      <w:r>
+        <w:rPr>
+          <w:b/>
+        </w:rPr>
+        <w:t>Dismiss alert</w:t>
+      </w:r>
+      <w:r>
+        <w:t xml:space="preserve"> apenas quando houver uma justificativa válida (por exemplo, falso positivo ou uso deliberado em teste), registre o contexto e siga a política de revisão da equipe. Dispensar fecha o alerta no painel, registra a razão e não corrige o código.</w:t>
+      </w:r>
+    </w:p>
+    <w:p>
+      <w:r>
+        <w:t xml:space="preserve">Se a política exigir controle adicional, a mantenedora pode configurar </w:t>
       </w:r>
       <w:r>
         <w:rPr>
@@ -1400,7 +1439,7 @@
         <w:t>delegated alert dismissal</w:t>
       </w:r>
       <w:r>
-        <w:t xml:space="preserve"> somente se a política exigir controle adicional: pessoas com acesso de escrita passam a solicitar a dispensa, e proprietários da organização/security managers podem aprovar ou rejeitar. A opção delegada não foi ativada neste exercício.</w:t>
+        <w:t>: pessoas com acesso de escrita solicitam a dispensa, e proprietários da organização ou security managers podem aprovar ou rejeitar. A opção delegada não foi ativada neste exercício.</w:t>
       </w:r>
     </w:p>
     <w:p>
@@ -1606,6 +1645,30 @@
       </w:pPr>
       <w:r>
         <w:t>Aprovação delegada de dispensas — https://docs.github.com/en/code-security/concepts/security-at-scale/delegated-alert-dismissal</w:t>
+      </w:r>
+    </w:p>
+    <w:p>
+      <w:pPr>
+        <w:pStyle w:val="ListBullet"/>
+      </w:pPr>
+      <w:r>
+        <w:t>Quem pode dispensar alertas de Code Scanning — https://docs.github.com/en/code-security/how-tos/manage-security-alerts/manage-code-scanning-alerts/triage-alerts-in-pull-requests</w:t>
+      </w:r>
+    </w:p>
+    <w:p>
+      <w:pPr>
+        <w:pStyle w:val="ListBullet"/>
+      </w:pPr>
+      <w:r>
+        <w:t>Concorrência de workflows e jobs — https://docs.github.com/en/actions/concepts/workflows-and-actions/concurrency</w:t>
+      </w:r>
+    </w:p>
+    <w:p>
+      <w:pPr>
+        <w:pStyle w:val="ListBullet"/>
+      </w:pPr>
+      <w:r>
+        <w:t>Limites do GitHub Actions — https://docs.github.com/en/actions/reference/limits</w:t>
       </w:r>
     </w:p>
     <w:p>

</xml_diff>

<commit_message>
Document CodeQL advanced workflow
</commit_message>
<xml_diff>
--- a/docs/guia-github-actions-e-seguranca.docx
+++ b/docs/guia-github-actions-e-seguranca.docx
@@ -348,7 +348,7 @@
           </w:tcPr>
           <w:p>
             <w:r>
-              <w:t>On, Default setup</w:t>
+              <w:t>On, Advanced setup</w:t>
             </w:r>
           </w:p>
         </w:tc>
@@ -359,7 +359,7 @@
           </w:tcPr>
           <w:p>
             <w:r>
-              <w:t xml:space="preserve">Analisou o PR #10 e encontrou um alerta High de SQL Injection em </w:t>
+              <w:t xml:space="preserve">O GitHub criou </w:t>
             </w:r>
             <w:r>
               <w:rPr>
@@ -367,10 +367,32 @@
                 <w:color w:val="5B2C83"/>
                 <w:sz w:val="18"/>
               </w:rPr>
-              <w:t>ProductRepository.java:42</w:t>
+              <w:t>.github/workflows/codeql.yml</w:t>
             </w:r>
             <w:r>
-              <w:t>.</w:t>
+              <w:t xml:space="preserve"> na </w:t>
+            </w:r>
+            <w:r>
+              <w:rPr>
+                <w:rFonts w:ascii="Consolas" w:hAnsi="Consolas"/>
+                <w:color w:val="5B2C83"/>
+                <w:sz w:val="18"/>
+              </w:rPr>
+              <w:t>main</w:t>
+            </w:r>
+            <w:r>
+              <w:t xml:space="preserve">; a execução inicial </w:t>
+            </w:r>
+            <w:r>
+              <w:rPr>
+                <w:rFonts w:ascii="Consolas" w:hAnsi="Consolas"/>
+                <w:color w:val="5B2C83"/>
+                <w:sz w:val="18"/>
+              </w:rPr>
+              <w:t>CodeQL Advanced #1</w:t>
+            </w:r>
+            <w:r>
+              <w:t xml:space="preserve"> terminou com sucesso. O PR #10 mantém o teste controlado de SQL Injection.</w:t>
             </w:r>
           </w:p>
         </w:tc>
@@ -522,7 +544,7 @@
         <w:rPr>
           <w:b/>
         </w:rPr>
-        <w:t>Captura 2 — estado histórico anterior ao PR #10:</w:t>
+        <w:t>Captura 2 — estado histórico anterior à ativação:</w:t>
       </w:r>
       <w:r>
         <w:t xml:space="preserve"> opções de atualização do Dependabot desligadas e CodeQL aguardando </w:t>
@@ -536,7 +558,7 @@
         <w:t>Set up</w:t>
       </w:r>
       <w:r>
-        <w:t>. A configuração atual do CodeQL está ativa via Default setup, conforme o resultado do PR #10 registrado adiante.</w:t>
+        <w:t>. A captura é anterior à configuração atual, que usa Advanced setup.</w:t>
       </w:r>
     </w:p>
     <w:p>
@@ -1032,7 +1054,7 @@
         <w:pStyle w:val="Heading2"/>
       </w:pPr>
       <w:r>
-        <w:t>C. Code Scanning com CodeQL — habilitado para o teste atual</w:t>
+        <w:t>C. Code Scanning com CodeQL — Advanced setup</w:t>
       </w:r>
     </w:p>
     <w:p>
@@ -1040,22 +1062,80 @@
         <w:pStyle w:val="ListNumber"/>
       </w:pPr>
       <w:r>
-        <w:t xml:space="preserve">A mantenedora ativou </w:t>
-      </w:r>
-      <w:r>
-        <w:rPr>
-          <w:b/>
-        </w:rPr>
-        <w:t>Default setup</w:t>
-      </w:r>
-      <w:r>
-        <w:t xml:space="preserve"> em </w:t>
+        <w:t xml:space="preserve">Em </w:t>
       </w:r>
       <w:r>
         <w:rPr>
           <w:b/>
         </w:rPr>
         <w:t>Settings &gt; Advanced Security &gt; Code Security &gt; CodeQL analysis</w:t>
+      </w:r>
+      <w:r>
+        <w:t>, a mantenedora desativou Default setup e selecionou Advanced setup.</w:t>
+      </w:r>
+    </w:p>
+    <w:p>
+      <w:pPr>
+        <w:pStyle w:val="ListNumber"/>
+      </w:pPr>
+      <w:r>
+        <w:t xml:space="preserve">O GitHub criou </w:t>
+      </w:r>
+      <w:r>
+        <w:rPr>
+          <w:rFonts w:ascii="Consolas" w:hAnsi="Consolas"/>
+          <w:color w:val="5B2C83"/>
+          <w:sz w:val="18"/>
+        </w:rPr>
+        <w:t>.github/workflows/codeql.yml</w:t>
+      </w:r>
+      <w:r>
+        <w:t xml:space="preserve"> na branch </w:t>
+      </w:r>
+      <w:r>
+        <w:rPr>
+          <w:rFonts w:ascii="Consolas" w:hAnsi="Consolas"/>
+          <w:color w:val="5B2C83"/>
+          <w:sz w:val="18"/>
+        </w:rPr>
+        <w:t>main</w:t>
+      </w:r>
+      <w:r>
+        <w:t xml:space="preserve"> (commit </w:t>
+      </w:r>
+      <w:r>
+        <w:rPr>
+          <w:rFonts w:ascii="Consolas" w:hAnsi="Consolas"/>
+          <w:color w:val="5B2C83"/>
+          <w:sz w:val="18"/>
+        </w:rPr>
+        <w:t>0087afb</w:t>
+      </w:r>
+      <w:r>
+        <w:t xml:space="preserve">). A lista de Actions passou a exibir </w:t>
+      </w:r>
+      <w:r>
+        <w:rPr>
+          <w:b/>
+        </w:rPr>
+        <w:t>CodeQL Advanced</w:t>
+      </w:r>
+      <w:r>
+        <w:t xml:space="preserve">; a execução inicial </w:t>
+      </w:r>
+      <w:r>
+        <w:rPr>
+          <w:rFonts w:ascii="Consolas" w:hAnsi="Consolas"/>
+          <w:color w:val="5B2C83"/>
+          <w:sz w:val="18"/>
+        </w:rPr>
+        <w:t>#1</w:t>
+      </w:r>
+      <w:r>
+        <w:t xml:space="preserve"> terminou com sucesso em 1 min 44 s: </w:t>
+      </w:r>
+      <w:r>
+        <w:t>ver execução — https://github.com/aeroschmidt/scanner-loja-instrumentos/actions/runs/38104871050</w:t>
       </w:r>
       <w:r>
         <w:t>.</w:t>
@@ -1066,7 +1146,62 @@
         <w:pStyle w:val="ListNumber"/>
       </w:pPr>
       <w:r>
-        <w:t>O GitHub identificou linguagens do repositório e executou a análise no PR #10.</w:t>
+        <w:t xml:space="preserve">O workflow usa </w:t>
+      </w:r>
+      <w:r>
+        <w:rPr>
+          <w:rFonts w:ascii="Consolas" w:hAnsi="Consolas"/>
+          <w:color w:val="5B2C83"/>
+          <w:sz w:val="18"/>
+        </w:rPr>
+        <w:t>push</w:t>
+      </w:r>
+      <w:r>
+        <w:t xml:space="preserve"> para </w:t>
+      </w:r>
+      <w:r>
+        <w:rPr>
+          <w:rFonts w:ascii="Consolas" w:hAnsi="Consolas"/>
+          <w:color w:val="5B2C83"/>
+          <w:sz w:val="18"/>
+        </w:rPr>
+        <w:t>main</w:t>
+      </w:r>
+      <w:r>
+        <w:t xml:space="preserve">, </w:t>
+      </w:r>
+      <w:r>
+        <w:rPr>
+          <w:rFonts w:ascii="Consolas" w:hAnsi="Consolas"/>
+          <w:color w:val="5B2C83"/>
+          <w:sz w:val="18"/>
+        </w:rPr>
+        <w:t>pull_request</w:t>
+      </w:r>
+      <w:r>
+        <w:t xml:space="preserve"> destinado a </w:t>
+      </w:r>
+      <w:r>
+        <w:rPr>
+          <w:rFonts w:ascii="Consolas" w:hAnsi="Consolas"/>
+          <w:color w:val="5B2C83"/>
+          <w:sz w:val="18"/>
+        </w:rPr>
+        <w:t>main</w:t>
+      </w:r>
+      <w:r>
+        <w:t xml:space="preserve"> e uma agenda semanal (</w:t>
+      </w:r>
+      <w:r>
+        <w:rPr>
+          <w:rFonts w:ascii="Consolas" w:hAnsi="Consolas"/>
+          <w:color w:val="5B2C83"/>
+          <w:sz w:val="18"/>
+        </w:rPr>
+        <w:t>cron: '20 3 * * 2'</w:t>
+      </w:r>
+      <w:r>
+        <w:t>, terça-feira às 03:20 UTC, 00:20 no horário de Brasília).</w:t>
       </w:r>
     </w:p>
     <w:p>
@@ -1074,7 +1209,73 @@
         <w:pStyle w:val="ListNumber"/>
       </w:pPr>
       <w:r>
-        <w:t>O resultado deste exercício é um alerta High de SQL Injection com arquivo e linha; consulte o guia do usuário para ver capturas e entender o que o autor e revisor do PR devem fazer.</w:t>
+        <w:t xml:space="preserve">O matrix analisa </w:t>
+      </w:r>
+      <w:r>
+        <w:rPr>
+          <w:rFonts w:ascii="Consolas" w:hAnsi="Consolas"/>
+          <w:color w:val="5B2C83"/>
+          <w:sz w:val="18"/>
+        </w:rPr>
+        <w:t>actions</w:t>
+      </w:r>
+      <w:r>
+        <w:t xml:space="preserve">, </w:t>
+      </w:r>
+      <w:r>
+        <w:rPr>
+          <w:rFonts w:ascii="Consolas" w:hAnsi="Consolas"/>
+          <w:color w:val="5B2C83"/>
+          <w:sz w:val="18"/>
+        </w:rPr>
+        <w:t>java-kotlin</w:t>
+      </w:r>
+      <w:r>
+        <w:t xml:space="preserve"> e </w:t>
+      </w:r>
+      <w:r>
+        <w:rPr>
+          <w:rFonts w:ascii="Consolas" w:hAnsi="Consolas"/>
+          <w:color w:val="5B2C83"/>
+          <w:sz w:val="18"/>
+        </w:rPr>
+        <w:t>javascript-typescript</w:t>
+      </w:r>
+      <w:r>
+        <w:t xml:space="preserve">, detectadas para este repositório. O modo </w:t>
+      </w:r>
+      <w:r>
+        <w:rPr>
+          <w:rFonts w:ascii="Consolas" w:hAnsi="Consolas"/>
+          <w:color w:val="5B2C83"/>
+          <w:sz w:val="18"/>
+        </w:rPr>
+        <w:t>none</w:t>
+      </w:r>
+      <w:r>
+        <w:t xml:space="preserve"> para Java cria a base sem executar o Maven e é suportado; </w:t>
+      </w:r>
+      <w:r>
+        <w:rPr>
+          <w:rFonts w:ascii="Consolas" w:hAnsi="Consolas"/>
+          <w:color w:val="5B2C83"/>
+          <w:sz w:val="18"/>
+        </w:rPr>
+        <w:t>autobuild</w:t>
+      </w:r>
+      <w:r>
+        <w:t xml:space="preserve"> ou </w:t>
+      </w:r>
+      <w:r>
+        <w:rPr>
+          <w:rFonts w:ascii="Consolas" w:hAnsi="Consolas"/>
+          <w:color w:val="5B2C83"/>
+          <w:sz w:val="18"/>
+        </w:rPr>
+        <w:t>manual</w:t>
+      </w:r>
+      <w:r>
+        <w:t xml:space="preserve"> podem ser avaliados se for necessário analisar código gerado ou restringir a análise ao que o build compila.</w:t>
       </w:r>
     </w:p>
     <w:p>
@@ -1082,12 +1283,69 @@
         <w:pStyle w:val="ListNumber"/>
       </w:pPr>
       <w:r>
-        <w:t>Um alerta no painel e o status do check são coisas diferentes. Só há bloqueio de merge quando as regras de proteção da branch exigem o check apropriado.</w:t>
+        <w:t xml:space="preserve">O workflow concede </w:t>
+      </w:r>
+      <w:r>
+        <w:rPr>
+          <w:rFonts w:ascii="Consolas" w:hAnsi="Consolas"/>
+          <w:color w:val="5B2C83"/>
+          <w:sz w:val="18"/>
+        </w:rPr>
+        <w:t>security-events: write</w:t>
+      </w:r>
+      <w:r>
+        <w:t xml:space="preserve"> para publicar resultados e permissões de leitura para obter o código e actions. Não há token Sonar nem integração com Sonar neste workflow.</w:t>
+      </w:r>
+    </w:p>
+    <w:p>
+      <w:pPr>
+        <w:pStyle w:val="ListNumber"/>
+      </w:pPr>
+      <w:r>
+        <w:t xml:space="preserve">Para verificar o resultado, abra </w:t>
+      </w:r>
+      <w:r>
+        <w:rPr>
+          <w:b/>
+        </w:rPr>
+        <w:t>Actions &gt; CodeQL Advanced</w:t>
+      </w:r>
+      <w:r>
+        <w:t xml:space="preserve">, selecione uma execução e confira as análises por linguagem. No PR, consulte </w:t>
+      </w:r>
+      <w:r>
+        <w:rPr>
+          <w:b/>
+        </w:rPr>
+        <w:t>Checks</w:t>
+      </w:r>
+      <w:r>
+        <w:t xml:space="preserve"> e </w:t>
+      </w:r>
+      <w:r>
+        <w:rPr>
+          <w:b/>
+        </w:rPr>
+        <w:t>Security</w:t>
+      </w:r>
+      <w:r>
+        <w:t>; o check pode terminar verde mesmo quando há alerta. Para bloquear merge, configure uma regra de proteção que exija o check apropriado.</w:t>
       </w:r>
     </w:p>
     <w:p>
       <w:r>
-        <w:t>Default setup é uma configuração do Code Scanning gerenciada pelo GitHub. Não é necessário acrescentar manualmente uma segunda workflow de CodeQL para esse caminho.</w:t>
+        <w:t xml:space="preserve">O workflow é configuração versionada: gatilhos, linguagens, permissões, versões de actions e estratégia de build podem ser revistos no diff do PR. A execução inicial na </w:t>
+      </w:r>
+      <w:r>
+        <w:rPr>
+          <w:rFonts w:ascii="Consolas" w:hAnsi="Consolas"/>
+          <w:color w:val="5B2C83"/>
+          <w:sz w:val="18"/>
+        </w:rPr>
+        <w:t>main</w:t>
+      </w:r>
+      <w:r>
+        <w:t xml:space="preserve"> comprova que o workflow avançado executou; a execução seguinte em PR permite observar os resultados da branch desse PR.</w:t>
       </w:r>
     </w:p>
     <w:p>
@@ -1620,7 +1878,15 @@
         <w:pStyle w:val="ListBullet"/>
       </w:pPr>
       <w:r>
-        <w:t>Configurar Code Scanning default setup — https://docs.github.com/en/code-security/how-tos/find-and-fix-code-vulnerabilities/configure-code-scanning/configure-code-scanning</w:t>
+        <w:t>Configurar Code Scanning advanced setup — https://docs.github.com/en/code-security/how-tos/find-and-fix-code-vulnerabilities/configure-code-scanning/configuring-advanced-setup-for-code-scanning</w:t>
+      </w:r>
+    </w:p>
+    <w:p>
+      <w:pPr>
+        <w:pStyle w:val="ListBullet"/>
+      </w:pPr>
+      <w:r>
+        <w:t>CodeQL para linguagens compiladas e modos de build — https://docs.github.com/en/code-security/how-tos/find-and-fix-code-vulnerabilities/manage-your-configuration/codeql-for-compiled-languages</w:t>
       </w:r>
     </w:p>
     <w:p>
@@ -1708,7 +1974,18 @@
         <w:pStyle w:val="ListBullet"/>
       </w:pPr>
       <w:r>
-        <w:t xml:space="preserve">O workflow executa Maven </w:t>
+        <w:t xml:space="preserve">O workflow </w:t>
+      </w:r>
+      <w:r>
+        <w:rPr>
+          <w:rFonts w:ascii="Consolas" w:hAnsi="Consolas"/>
+          <w:color w:val="5B2C83"/>
+          <w:sz w:val="18"/>
+        </w:rPr>
+        <w:t>build.yml</w:t>
+      </w:r>
+      <w:r>
+        <w:t xml:space="preserve"> executa Maven </w:t>
       </w:r>
       <w:r>
         <w:rPr>
@@ -1719,7 +1996,18 @@
         <w:t>verify</w:t>
       </w:r>
       <w:r>
-        <w:t>; a análise CodeQL é configurada separadamente nas opções de segurança do repositório.</w:t>
+        <w:t xml:space="preserve">; o workflow </w:t>
+      </w:r>
+      <w:r>
+        <w:rPr>
+          <w:rFonts w:ascii="Consolas" w:hAnsi="Consolas"/>
+          <w:color w:val="5B2C83"/>
+          <w:sz w:val="18"/>
+        </w:rPr>
+        <w:t>codeql.yml</w:t>
+      </w:r>
+      <w:r>
+        <w:t xml:space="preserve"> executa CodeQL em um job separado.</w:t>
       </w:r>
     </w:p>
     <w:p>
@@ -1804,7 +2092,21 @@
         <w:pStyle w:val="ListBullet"/>
       </w:pPr>
       <w:r>
-        <w:t>Code Scanning/CodeQL está ativo via Default setup para o exercício; Dependabot e Secret Protection continuam desligados conforme o escopo.</w:t>
+        <w:t>Code Scanning/CodeQL está ativo via Advanced setup; Dependabot e Secret Protection continuam desligados conforme o escopo.</w:t>
+      </w:r>
+    </w:p>
+    <w:p>
+      <w:pPr>
+        <w:pStyle w:val="ListBullet"/>
+      </w:pPr>
+      <w:r>
+        <w:t xml:space="preserve">Execução inicial do workflow avançado: </w:t>
+      </w:r>
+      <w:r>
+        <w:t>CodeQL Advanced #1 — https://github.com/aeroschmidt/scanner-loja-instrumentos/actions/runs/38104871050</w:t>
+      </w:r>
+      <w:r>
+        <w:t>, concluída com sucesso em 10/10/2026.</w:t>
       </w:r>
     </w:p>
     <w:p>

</xml_diff>

<commit_message>
Record CodeQL pull request findings
</commit_message>
<xml_diff>
--- a/docs/guia-github-actions-e-seguranca.docx
+++ b/docs/guia-github-actions-e-seguranca.docx
@@ -1138,7 +1138,7 @@
         <w:t>ver execução — https://github.com/aeroschmidt/scanner-loja-instrumentos/actions/runs/38104871050</w:t>
       </w:r>
       <w:r>
-        <w:t>.</w:t>
+        <w:t>. A página do run mostra três jobs, todos concluídos.</w:t>
       </w:r>
     </w:p>
     <w:p>
@@ -1334,7 +1334,16 @@
     </w:p>
     <w:p>
       <w:r>
-        <w:t xml:space="preserve">O workflow é configuração versionada: gatilhos, linguagens, permissões, versões de actions e estratégia de build podem ser revistos no diff do PR. A execução inicial na </w:t>
+        <w:t xml:space="preserve">O workflow é configuração versionada: gatilhos, linguagens, permissões, versões de actions e estratégia de build podem ser revistos no diff do PR. Após um commit de documentação sincronizar o PR #10, a execução </w:t>
+      </w:r>
+      <w:r>
+        <w:rPr>
+          <w:b/>
+        </w:rPr>
+        <w:t>CodeQL Advanced #2</w:t>
+      </w:r>
+      <w:r>
+        <w:t xml:space="preserve"> rodou em </w:t>
       </w:r>
       <w:r>
         <w:rPr>
@@ -1342,10 +1351,36 @@
           <w:color w:val="5B2C83"/>
           <w:sz w:val="18"/>
         </w:rPr>
-        <w:t>main</w:t>
+        <w:t>pull_request</w:t>
       </w:r>
       <w:r>
-        <w:t xml:space="preserve"> comprova que o workflow avançado executou; a execução seguinte em PR permite observar os resultados da branch desse PR.</w:t>
+        <w:t xml:space="preserve"> e concluiu os três jobs em 1 min 11 s: </w:t>
+      </w:r>
+      <w:r>
+        <w:t>ver execução — https://github.com/aeroschmidt/scanner-loja-instrumentos/actions/runs/38105212367</w:t>
+      </w:r>
+      <w:r>
+        <w:t xml:space="preserve">. O Code Scanning publicou um alerta novo High na linha 42 de </w:t>
+      </w:r>
+      <w:r>
+        <w:rPr>
+          <w:rFonts w:ascii="Consolas" w:hAnsi="Consolas"/>
+          <w:color w:val="5B2C83"/>
+          <w:sz w:val="18"/>
+        </w:rPr>
+        <w:t>ProductRepository.java</w:t>
+      </w:r>
+      <w:r>
+        <w:t xml:space="preserve">; como a configuração de check falha para High ou superior, o check agregado </w:t>
+      </w:r>
+      <w:r>
+        <w:rPr>
+          <w:b/>
+        </w:rPr>
+        <w:t>Code scanning results</w:t>
+      </w:r>
+      <w:r>
+        <w:t xml:space="preserve"> ficou vermelho. A execução do workflow está verde, o check que resume alertas está vermelho e o PR ainda aparece como apto a merge: a equipe precisa configurar regra de proteção se quiser transformar esse check em bloqueio.</w:t>
       </w:r>
     </w:p>
     <w:p>
@@ -2114,6 +2149,26 @@
         <w:pStyle w:val="ListBullet"/>
       </w:pPr>
       <w:r>
+        <w:t xml:space="preserve">Execução no PR #10: </w:t>
+      </w:r>
+      <w:r>
+        <w:t>CodeQL Advanced #2 — https://github.com/aeroschmidt/scanner-loja-instrumentos/actions/runs/38105212367</w:t>
+      </w:r>
+      <w:r>
+        <w:t xml:space="preserve">, três jobs concluídos; </w:t>
+      </w:r>
+      <w:r>
+        <w:t>resumo do check e anotação na linha 42 — https://github.com/aeroschmidt/scanner-loja-instrumentos/pull/10/checks?check_run_id=114369258145</w:t>
+      </w:r>
+      <w:r>
+        <w:t>.</w:t>
+      </w:r>
+    </w:p>
+    <w:p>
+      <w:pPr>
+        <w:pStyle w:val="ListBullet"/>
+      </w:pPr>
+      <w:r>
         <w:t>A proprietária revisa e aprova PRs. O assistente não aprova nem mescla.</w:t>
       </w:r>
     </w:p>

</xml_diff>

<commit_message>
Schedule CodeQL scans daily at noon
</commit_message>
<xml_diff>
--- a/docs/guia-github-actions-e-seguranca.docx
+++ b/docs/guia-github-actions-e-seguranca.docx
@@ -53,7 +53,7 @@
     </w:p>
     <w:p>
       <w:r>
-        <w:t>Este guia registra o que está ativo, o que ainda está desligado e como cada participante acompanha os testes. A sequência será uma ferramenta por vez. Nenhuma ferramenta de GHAS é habilitada por este documento.</w:t>
+        <w:t>Este guia registra o que está ativo, o que ainda está desligado e como a mantenedora acompanha os testes. As ferramentas são habilitadas uma por vez.</w:t>
       </w:r>
     </w:p>
     <w:p>
@@ -221,52 +221,6 @@
           </w:tcPr>
           <w:p>
             <w:r>
-              <w:t>Sonar no workflow</w:t>
-            </w:r>
-          </w:p>
-        </w:tc>
-        <w:tc>
-          <w:tcPr>
-            <w:tcW w:type="dxa" w:w="3331"/>
-            <w:vAlign w:val="center"/>
-          </w:tcPr>
-          <w:p>
-            <w:r>
-              <w:t>Removido nesta etapa</w:t>
-            </w:r>
-          </w:p>
-        </w:tc>
-        <w:tc>
-          <w:tcPr>
-            <w:tcW w:type="dxa" w:w="3331"/>
-            <w:vAlign w:val="center"/>
-          </w:tcPr>
-          <w:p>
-            <w:r>
-              <w:t xml:space="preserve">O workflow não chama Sonar nem lê </w:t>
-            </w:r>
-            <w:r>
-              <w:rPr>
-                <w:rFonts w:ascii="Consolas" w:hAnsi="Consolas"/>
-                <w:color w:val="5B2C83"/>
-                <w:sz w:val="18"/>
-              </w:rPr>
-              <w:t>SONAR_TOKEN</w:t>
-            </w:r>
-            <w:r>
-              <w:t>. A análise local continua descrita no README.</w:t>
-            </w:r>
-          </w:p>
-        </w:tc>
-      </w:tr>
-      <w:tr>
-        <w:tc>
-          <w:tcPr>
-            <w:tcW w:type="dxa" w:w="3331"/>
-            <w:vAlign w:val="center"/>
-          </w:tcPr>
-          <w:p>
-            <w:r>
               <w:t>Dependency graph</w:t>
             </w:r>
           </w:p>
@@ -394,7 +348,7 @@
           </w:tcPr>
           <w:p>
             <w:r>
-              <w:t>Off</w:t>
+              <w:t>Advanced setup ativo</w:t>
             </w:r>
           </w:p>
         </w:tc>
@@ -405,7 +359,15 @@
           </w:tcPr>
           <w:p>
             <w:r>
-              <w:t xml:space="preserve">Settings oferece </w:t>
+              <w:rPr>
+                <w:rFonts w:ascii="Consolas" w:hAnsi="Consolas"/>
+                <w:color w:val="5B2C83"/>
+                <w:sz w:val="18"/>
+              </w:rPr>
+              <w:t>.github/workflows/codeql.yml</w:t>
+            </w:r>
+            <w:r>
+              <w:t xml:space="preserve"> analisa </w:t>
             </w:r>
             <w:r>
               <w:rPr>
@@ -413,10 +375,10 @@
                 <w:color w:val="5B2C83"/>
                 <w:sz w:val="18"/>
               </w:rPr>
-              <w:t>Set up</w:t>
+              <w:t>main</w:t>
             </w:r>
             <w:r>
-              <w:t>; não está escaneando o código.</w:t>
+              <w:t xml:space="preserve"> em push/PR e executa uma varredura diária ao meio-dia de Brasília.</w:t>
             </w:r>
           </w:p>
         </w:tc>
@@ -506,6 +468,11 @@
     <w:p/>
     <w:p>
       <w:r>
+        <w:t>As Capturas 1–4 registram o estado anterior à ativação do CodeQL. A Captura 2, em particular, mostra CodeQL ainda aguardando configuração; use a seção C abaixo para o estado atual.</w:t>
+      </w:r>
+    </w:p>
+    <w:p>
+      <w:r>
         <w:rPr>
           <w:b/>
         </w:rPr>
@@ -568,10 +535,10 @@
         <w:rPr>
           <w:b/>
         </w:rPr>
-        <w:t>Captura 2 — Dependabot e CodeQL:</w:t>
+        <w:t>Captura 2 — estado histórico antes do CodeQL:</w:t>
       </w:r>
       <w:r>
-        <w:t xml:space="preserve"> opções de atualização do Dependabot desligadas e CodeQL aguardando </w:t>
+        <w:t xml:space="preserve"> Dependabot desligado e CodeQL ainda aguardando </w:t>
       </w:r>
       <w:r>
         <w:rPr>
@@ -582,7 +549,7 @@
         <w:t>Set up</w:t>
       </w:r>
       <w:r>
-        <w:t>.</w:t>
+        <w:t>. Esta captura antecede a configuração Advanced descrita abaixo.</w:t>
       </w:r>
     </w:p>
     <w:p>
@@ -869,16 +836,7 @@
         <w:pStyle w:val="ListNumber"/>
       </w:pPr>
       <w:r>
-        <w:t xml:space="preserve">Abra </w:t>
-      </w:r>
-      <w:r>
-        <w:rPr>
-          <w:b/>
-        </w:rPr>
-        <w:t>Build, test, and analyze with SonarQube</w:t>
-      </w:r>
-      <w:r>
-        <w:t xml:space="preserve"> apenas em execuções históricas; no workflow atual, o step executa </w:t>
+        <w:t xml:space="preserve">Confira os steps de compilação e teste; o workflow executa </w:t>
       </w:r>
       <w:r>
         <w:rPr>
@@ -913,7 +871,7 @@
     </w:p>
     <w:p>
       <w:r>
-        <w:t>O Actions coordena o workflow; Maven compila o projeto e roda os testes. Um check de Actions não significa que CodeQL, Dependabot ou Secret Scanning estejam ativos.</w:t>
+        <w:t>O Actions coordena os workflows; Maven compila o projeto e roda os testes. O workflow Maven e o workflow CodeQL são checks independentes.</w:t>
       </w:r>
     </w:p>
     <w:p>
@@ -1099,32 +1057,32 @@
         <w:pStyle w:val="Heading2"/>
       </w:pPr>
       <w:r>
-        <w:t>C. Code Scanning com CodeQL — etapa separada</w:t>
+        <w:t>C. Code Scanning com CodeQL — Advanced setup ativo</w:t>
       </w:r>
     </w:p>
     <w:p>
-      <w:pPr>
-        <w:pStyle w:val="ListNumber"/>
-      </w:pPr>
       <w:r>
-        <w:t xml:space="preserve">Abra </w:t>
+        <w:t xml:space="preserve">O workflow editável </w:t>
+      </w:r>
+      <w:r>
+        <w:rPr>
+          <w:rFonts w:ascii="Consolas" w:hAnsi="Consolas"/>
+          <w:color w:val="5B2C83"/>
+          <w:sz w:val="18"/>
+        </w:rPr>
+        <w:t>.github/workflows/codeql.yml</w:t>
+      </w:r>
+      <w:r>
+        <w:t xml:space="preserve"> foi criado pelo assistente </w:t>
       </w:r>
       <w:r>
         <w:rPr>
           <w:b/>
         </w:rPr>
-        <w:t>Settings &gt; Advanced Security &gt; Code Security &gt; CodeQL analysis &gt; Set up</w:t>
+        <w:t>Advanced setup</w:t>
       </w:r>
       <w:r>
-        <w:t>.</w:t>
-      </w:r>
-    </w:p>
-    <w:p>
-      <w:pPr>
-        <w:pStyle w:val="ListNumber"/>
-      </w:pPr>
-      <w:r>
-        <w:t xml:space="preserve">Prefira </w:t>
+        <w:t xml:space="preserve"> do GitHub. O </w:t>
       </w:r>
       <w:r>
         <w:rPr>
@@ -1133,32 +1091,171 @@
         <w:t>Default setup</w:t>
       </w:r>
       <w:r>
-        <w:t xml:space="preserve"> para este teste inicial. Revise as linguagens que o GitHub detectou e a configuração proposta.</w:t>
+        <w:t xml:space="preserve"> é administrado pela interface; Advanced setup deixa a configuração em YAML para controlar linguagens, matriz, build e eventos. A imagem do material didático compara esses dois modos; ela não é uma tela específica deste repositório.</w:t>
       </w:r>
     </w:p>
     <w:p>
       <w:pPr>
-        <w:pStyle w:val="ListNumber"/>
+        <w:jc w:val="center"/>
       </w:pPr>
       <w:r>
-        <w:t xml:space="preserve">Confirme </w:t>
+        <w:drawing>
+          <wp:inline xmlns:a="http://schemas.openxmlformats.org/drawingml/2006/main" xmlns:pic="http://schemas.openxmlformats.org/drawingml/2006/picture">
+            <wp:extent cx="5806440" cy="3439334"/>
+            <wp:docPr id="5" name="Picture 5"/>
+            <wp:cNvGraphicFramePr>
+              <a:graphicFrameLocks noChangeAspect="1"/>
+            </wp:cNvGraphicFramePr>
+            <a:graphic>
+              <a:graphicData uri="http://schemas.openxmlformats.org/drawingml/2006/picture">
+                <pic:pic>
+                  <pic:nvPicPr>
+                    <pic:cNvPr id="0" name="05-github-docs-default-advanced.png"/>
+                    <pic:cNvPicPr/>
+                  </pic:nvPicPr>
+                  <pic:blipFill>
+                    <a:blip r:embed="rId15"/>
+                    <a:stretch>
+                      <a:fillRect/>
+                    </a:stretch>
+                  </pic:blipFill>
+                  <pic:spPr>
+                    <a:xfrm>
+                      <a:off x="0" y="0"/>
+                      <a:ext cx="5806440" cy="3439334"/>
+                    </a:xfrm>
+                    <a:prstGeom prst="rect"/>
+                  </pic:spPr>
+                </pic:pic>
+              </a:graphicData>
+            </a:graphic>
+          </wp:inline>
+        </w:drawing>
+      </w:r>
+    </w:p>
+    <w:p>
+      <w:pPr>
+        <w:pStyle w:val="Caption"/>
+        <w:jc w:val="center"/>
+      </w:pPr>
+      <w:r>
+        <w:t>Material do GitHub Docs: Default setup é gerenciado pelo GitHub; Advanced setup gera um workflow que pode ser editado</w:t>
+      </w:r>
+    </w:p>
+    <w:p>
+      <w:r>
+        <w:t xml:space="preserve">O workflow analisa pushes para </w:t>
+      </w:r>
+      <w:r>
+        <w:rPr>
+          <w:rFonts w:ascii="Consolas" w:hAnsi="Consolas"/>
+          <w:color w:val="5B2C83"/>
+          <w:sz w:val="18"/>
+        </w:rPr>
+        <w:t>main</w:t>
+      </w:r>
+      <w:r>
+        <w:t xml:space="preserve">, PRs destinados a </w:t>
+      </w:r>
+      <w:r>
+        <w:rPr>
+          <w:rFonts w:ascii="Consolas" w:hAnsi="Consolas"/>
+          <w:color w:val="5B2C83"/>
+          <w:sz w:val="18"/>
+        </w:rPr>
+        <w:t>main</w:t>
+      </w:r>
+      <w:r>
+        <w:t xml:space="preserve"> e executa uma varredura agendada todos os dias ao meio-dia no horário de Brasília (</w:t>
+      </w:r>
+      <w:r>
+        <w:rPr>
+          <w:rFonts w:ascii="Consolas" w:hAnsi="Consolas"/>
+          <w:color w:val="5B2C83"/>
+          <w:sz w:val="18"/>
+        </w:rPr>
+        <w:t>cron: '0 12 * * *'</w:t>
+      </w:r>
+      <w:r>
+        <w:t xml:space="preserve">, fuso </w:t>
+      </w:r>
+      <w:r>
+        <w:rPr>
+          <w:rFonts w:ascii="Consolas" w:hAnsi="Consolas"/>
+          <w:color w:val="5B2C83"/>
+          <w:sz w:val="18"/>
+        </w:rPr>
+        <w:t>America/Sao_Paulo</w:t>
+      </w:r>
+      <w:r>
+        <w:t xml:space="preserve">). O evento </w:t>
+      </w:r>
+      <w:r>
+        <w:rPr>
+          <w:rFonts w:ascii="Consolas" w:hAnsi="Consolas"/>
+          <w:color w:val="5B2C83"/>
+          <w:sz w:val="18"/>
+        </w:rPr>
+        <w:t>schedule</w:t>
+      </w:r>
+      <w:r>
+        <w:t xml:space="preserve"> executa a versão que está na branch padrão. Portanto, o novo horário passa a valer quando esta alteração chegar à </w:t>
+      </w:r>
+      <w:r>
+        <w:rPr>
+          <w:rFonts w:ascii="Consolas" w:hAnsi="Consolas"/>
+          <w:color w:val="5B2C83"/>
+          <w:sz w:val="18"/>
+        </w:rPr>
+        <w:t>main</w:t>
+      </w:r>
+      <w:r>
+        <w:t xml:space="preserve">. A análise diária publica resultados; não cria nem mescla commits. O GitHub pode atrasar uma execução agendada durante períodos de alta demanda. Não há gatilho </w:t>
+      </w:r>
+      <w:r>
+        <w:rPr>
+          <w:rFonts w:ascii="Consolas" w:hAnsi="Consolas"/>
+          <w:color w:val="5B2C83"/>
+          <w:sz w:val="18"/>
+        </w:rPr>
+        <w:t>workflow_dispatch</w:t>
+      </w:r>
+      <w:r>
+        <w:t xml:space="preserve">, então o botão </w:t>
       </w:r>
       <w:r>
         <w:rPr>
           <w:b/>
         </w:rPr>
-        <w:t>Enable CodeQL</w:t>
+        <w:t>Run workflow</w:t>
       </w:r>
       <w:r>
-        <w:t xml:space="preserve"> somente quando este teste for autorizado.</w:t>
+        <w:t xml:space="preserve"> não está configurado.</w:t>
       </w:r>
     </w:p>
     <w:p>
-      <w:pPr>
-        <w:pStyle w:val="ListNumber"/>
-      </w:pPr>
       <w:r>
-        <w:t xml:space="preserve">Aguarde a primeira análise e consulte </w:t>
+        <w:t xml:space="preserve">Para administrar: revise o YAML em </w:t>
+      </w:r>
+      <w:r>
+        <w:rPr>
+          <w:rFonts w:ascii="Consolas" w:hAnsi="Consolas"/>
+          <w:color w:val="5B2C83"/>
+          <w:sz w:val="18"/>
+        </w:rPr>
+        <w:t>.github/workflows/codeql.yml</w:t>
+      </w:r>
+      <w:r>
+        <w:t xml:space="preserve">, acompanhe </w:t>
+      </w:r>
+      <w:r>
+        <w:rPr>
+          <w:b/>
+        </w:rPr>
+        <w:t>Actions &gt; CodeQL Advanced</w:t>
+      </w:r>
+      <w:r>
+        <w:t xml:space="preserve"> e depois </w:t>
       </w:r>
       <w:r>
         <w:rPr>
@@ -1167,28 +1264,7 @@
         <w:t>Security &gt; Code scanning</w:t>
       </w:r>
       <w:r>
-        <w:t>.</w:t>
-      </w:r>
-    </w:p>
-    <w:p>
-      <w:pPr>
-        <w:pStyle w:val="ListNumber"/>
-      </w:pPr>
-      <w:r>
-        <w:t>Em um PR de teste autorizado, confira alertas, arquivo/linha, explicação, severidade e o check de Code Scanning.</w:t>
-      </w:r>
-    </w:p>
-    <w:p>
-      <w:pPr>
-        <w:pStyle w:val="ListNumber"/>
-      </w:pPr>
-      <w:r>
-        <w:t>Registre que falhar um check só bloqueia merge quando as regras de proteção da branch exigirem esse check.</w:t>
-      </w:r>
-    </w:p>
-    <w:p>
-      <w:r>
-        <w:t>Default setup é uma configuração do Code Scanning gerenciada pelo GitHub. Não é necessário acrescentar manualmente uma segunda workflow de CodeQL para esse caminho.</w:t>
+        <w:t>. A matriz atual analisa GitHub Actions, Java e JavaScript/TypeScript; a aplicação está em Java. Em um PR de demonstração, o job CodeQL terminou, mas o resultado agregado Code Scanning apontou uma injeção SQL de severidade alta na linha do repositório indicada pelo alerta. Um check vermelho não bloqueia merge automaticamente; isso depende das regras de proteção da branch.</w:t>
       </w:r>
     </w:p>
     <w:p>
@@ -1260,30 +1336,6 @@
     <w:p>
       <w:r>
         <w:t>Regras e disponibilidade de funcionalidades dependem de visibilidade e plano do repositório. Em repositórios públicos, o GitHub informa que envia alertas de padrões de parceiros aos provedores correspondentes; isso não deve ser confundido com a configuração dos alertas privados para a proprietária.</w:t>
-      </w:r>
-    </w:p>
-    <w:p>
-      <w:pPr>
-        <w:pStyle w:val="Heading2"/>
-      </w:pPr>
-      <w:r>
-        <w:t>E. Depois dos testes: Sonar por último</w:t>
-      </w:r>
-    </w:p>
-    <w:p>
-      <w:r>
-        <w:t xml:space="preserve">Quando Dependabot, CodeQL e Secret Scanning tiverem sido testados e registrados, a última etapa será reintroduzir Sonar no workflow. Então poderemos comparar checks nativos do GitHub com a análise e o Quality Gate do Sonar. Até lá, o workflow não usa </w:t>
-      </w:r>
-      <w:r>
-        <w:rPr>
-          <w:rFonts w:ascii="Consolas" w:hAnsi="Consolas"/>
-          <w:color w:val="5B2C83"/>
-          <w:sz w:val="18"/>
-        </w:rPr>
-        <w:t>SONAR_TOKEN</w:t>
-      </w:r>
-      <w:r>
-        <w:t>.</w:t>
       </w:r>
     </w:p>
     <w:p>
@@ -1477,7 +1529,15 @@
         <w:pStyle w:val="ListNumber"/>
       </w:pPr>
       <w:r>
-        <w:t>Aprender o workflow de Actions já ativo.</w:t>
+        <w:t>Acompanhar o workflow Maven e o CodeQL Advanced separadamente.</w:t>
+      </w:r>
+    </w:p>
+    <w:p>
+      <w:pPr>
+        <w:pStyle w:val="ListNumber"/>
+      </w:pPr>
+      <w:r>
+        <w:t>Observar a análise agendada diária do CodeQL.</w:t>
       </w:r>
     </w:p>
     <w:p>
@@ -1486,14 +1546,6 @@
       </w:pPr>
       <w:r>
         <w:t>Testar Dependabot isoladamente.</w:t>
-      </w:r>
-    </w:p>
-    <w:p>
-      <w:pPr>
-        <w:pStyle w:val="ListNumber"/>
-      </w:pPr>
-      <w:r>
-        <w:t>Testar Code Scanning/CodeQL isoladamente.</w:t>
       </w:r>
     </w:p>
     <w:p>
@@ -1510,14 +1562,6 @@
       </w:pPr>
       <w:r>
         <w:t>Consolidar capturas, o que apareceu nos PRs e o que cada papel deve fazer.</w:t>
-      </w:r>
-    </w:p>
-    <w:p>
-      <w:pPr>
-        <w:pStyle w:val="ListNumber"/>
-      </w:pPr>
-      <w:r>
-        <w:t>Reintegrar Sonar por último e comparar os resultados.</w:t>
       </w:r>
     </w:p>
     <w:p>
@@ -1554,7 +1598,7 @@
         <w:pStyle w:val="ListBullet"/>
       </w:pPr>
       <w:r>
-        <w:t>Configurar Code Scanning default setup — https://docs.github.com/en/code-security/how-tos/find-and-fix-code-vulnerabilities/configure-code-scanning/configure-code-scanning</w:t>
+        <w:t>Configurar Code Scanning Advanced setup — https://docs.github.com/en/code-security/how-tos/find-and-fix-code-vulnerabilities/configure-code-scanning/configuring-advanced-setup-for-code-scanning</w:t>
       </w:r>
     </w:p>
     <w:p>
@@ -1602,7 +1646,7 @@
         <w:pStyle w:val="ListBullet"/>
       </w:pPr>
       <w:r>
-        <w:t xml:space="preserve">O PR #7 remove a execução do Sonar do workflow e mantém Maven </w:t>
+        <w:t xml:space="preserve">CodeQL foi habilitado por Advanced setup em </w:t>
       </w:r>
       <w:r>
         <w:rPr>
@@ -1610,7 +1654,19 @@
           <w:color w:val="5B2C83"/>
           <w:sz w:val="18"/>
         </w:rPr>
-        <w:t>verify</w:t>
+        <w:t>.github/workflows/codeql.yml</w:t>
+      </w:r>
+      <w:r>
+        <w:t xml:space="preserve">; a execução inicial está em </w:t>
+      </w:r>
+      <w:r>
+        <w:t>CodeQL Advanced #1 — https://github.com/aeroschmidt/scanner-loja-instrumentos/actions/runs/38104871050</w:t>
+      </w:r>
+      <w:r>
+        <w:t xml:space="preserve"> e a execução mais recente em </w:t>
+      </w:r>
+      <w:r>
+        <w:t>CodeQL Advanced #3 — https://github.com/aeroschmidt/scanner-loja-instrumentos/actions/runs/38105323924</w:t>
       </w:r>
       <w:r>
         <w:t>.</w:t>
@@ -1621,48 +1677,10 @@
         <w:pStyle w:val="ListBullet"/>
       </w:pPr>
       <w:r>
-        <w:t xml:space="preserve">O workflow usa os eventos </w:t>
+        <w:t xml:space="preserve">A análise de PR executou os jobs de Actions, Java e JavaScript/TypeScript. O resultado agregado de Code Scanning aponta a vulnerabilidade de demonstração; consulte o </w:t>
       </w:r>
       <w:r>
-        <w:rPr>
-          <w:rFonts w:ascii="Consolas" w:hAnsi="Consolas"/>
-          <w:color w:val="5B2C83"/>
-          <w:sz w:val="18"/>
-        </w:rPr>
-        <w:t>push</w:t>
-      </w:r>
-      <w:r>
-        <w:t xml:space="preserve"> para </w:t>
-      </w:r>
-      <w:r>
-        <w:rPr>
-          <w:rFonts w:ascii="Consolas" w:hAnsi="Consolas"/>
-          <w:color w:val="5B2C83"/>
-          <w:sz w:val="18"/>
-        </w:rPr>
-        <w:t>main</w:t>
-      </w:r>
-      <w:r>
-        <w:t xml:space="preserve"> e </w:t>
-      </w:r>
-      <w:r>
-        <w:rPr>
-          <w:rFonts w:ascii="Consolas" w:hAnsi="Consolas"/>
-          <w:color w:val="5B2C83"/>
-          <w:sz w:val="18"/>
-        </w:rPr>
-        <w:t>pull_request</w:t>
-      </w:r>
-      <w:r>
-        <w:t xml:space="preserve"> para </w:t>
-      </w:r>
-      <w:r>
-        <w:rPr>
-          <w:rFonts w:ascii="Consolas" w:hAnsi="Consolas"/>
-          <w:color w:val="5B2C83"/>
-          <w:sz w:val="18"/>
-        </w:rPr>
-        <w:t>main</w:t>
+        <w:t>check do PR #10 — https://github.com/aeroschmidt/scanner-loja-instrumentos/pull/10/checks?check_run_id=114369610380</w:t>
       </w:r>
       <w:r>
         <w:t>.</w:t>
@@ -1673,13 +1691,7 @@
         <w:pStyle w:val="ListBullet"/>
       </w:pPr>
       <w:r>
-        <w:t xml:space="preserve">Após a atualização deste guia, a execução </w:t>
-      </w:r>
-      <w:r>
-        <w:t>#21 do Actions — https://github.com/aeroschmidt/scanner-loja-instrumentos/actions/runs/38094010130</w:t>
-      </w:r>
-      <w:r>
-        <w:t xml:space="preserve"> passou em 27 segundos no evento </w:t>
+        <w:t xml:space="preserve">O cron neste documento foi ajustado para análise diária ao meio-dia de Brasília. A mudança precisa estar na branch padrão para que o evento </w:t>
       </w:r>
       <w:r>
         <w:rPr>
@@ -1687,10 +1699,10 @@
           <w:color w:val="5B2C83"/>
           <w:sz w:val="18"/>
         </w:rPr>
-        <w:t>pull_request</w:t>
+        <w:t>schedule</w:t>
       </w:r>
       <w:r>
-        <w:t>.</w:t>
+        <w:t xml:space="preserve"> use o novo horário.</w:t>
       </w:r>
     </w:p>
     <w:p>
@@ -1698,7 +1710,7 @@
         <w:pStyle w:val="ListBullet"/>
       </w:pPr>
       <w:r>
-        <w:t>As ferramentas de GHAS continuam desligadas conforme o escopo acordado.</w:t>
+        <w:t>Dependabot e Secret Protection permanecem desligados; cada recurso será avaliado em uma etapa separada.</w:t>
       </w:r>
     </w:p>
     <w:p>
@@ -1706,7 +1718,7 @@
         <w:pStyle w:val="ListBullet"/>
       </w:pPr>
       <w:r>
-        <w:t>A proprietária revisa e aprova PRs. O assistente não aprova nem mescla.</w:t>
+        <w:t>A mantenedora revisa e aprova PRs, salvo autorização explícita e específica para uma ação diferente.</w:t>
       </w:r>
     </w:p>
     <w:sectPr>

</xml_diff>